<commit_message>
[29.0] Sync header/footer designs and Calm theme with main
Backport of PR #11137 (merged into main). These files had drifted
from main since the backport branch was created — main went through
further review rounds (content fixes, additional header/footer
sections) that never made it into this backport. Bring all 11
HeaderFooterDesign docx files and Calm.dotx in sync with main's
current content.
</commit_message>
<xml_diff>
--- a/src/Layers/W1/BaseApp/Foundation/Reporting/ReportParts/HeaderFooterDesign/ExternalDefaultDetailed.docx
+++ b/src/Layers/W1/BaseApp/Foundation/Reporting/ReportParts/HeaderFooterDesign/ExternalDefaultDetailed.docx
@@ -267,7 +267,7 @@
     <w:tr>
       <w:trPr>
         <w:cnfStyle w:val="100000000000" w:firstRow="1" w:lastRow="0" w:firstColumn="0" w:lastColumn="0" w:oddVBand="0" w:evenVBand="0" w:oddHBand="0" w:evenHBand="0" w:firstRowFirstColumn="0" w:firstRowLastColumn="0" w:lastRowFirstColumn="0" w:lastRowLastColumn="0"/>
-        <w:trHeight w:val="284"/>
+        <w:trHeight w:val="181"/>
       </w:trPr>
       <w:tc>
         <w:tcPr>
@@ -275,7 +275,7 @@
         </w:tcPr>
         <w:p>
           <w:pPr>
-            <w:spacing w:before="120" w:after="60"/>
+            <w:spacing w:before="120"/>
             <w:rPr>
               <w:rFonts w:cs="Segoe UI"/>
               <w:color w:val="242424"/>
@@ -317,7 +317,7 @@
         </w:tcPr>
         <w:p>
           <w:pPr>
-            <w:spacing w:before="120" w:after="60"/>
+            <w:spacing w:before="120"/>
             <w:rPr>
               <w:rFonts w:cs="Segoe UI"/>
               <w:color w:val="242424"/>
@@ -359,7 +359,7 @@
         </w:tcPr>
         <w:p>
           <w:pPr>
-            <w:spacing w:before="120" w:after="60"/>
+            <w:spacing w:before="120"/>
             <w:rPr>
               <w:rFonts w:cs="Segoe UI"/>
               <w:color w:val="242424"/>
@@ -401,7 +401,7 @@
         </w:tcPr>
         <w:p>
           <w:pPr>
-            <w:spacing w:before="120" w:after="60"/>
+            <w:spacing w:before="120"/>
             <w:rPr>
               <w:rFonts w:cs="Segoe UI"/>
               <w:color w:val="242424"/>
@@ -670,7 +670,7 @@
         <w:p>
           <w:pPr>
             <w:pStyle w:val="BCLabel"/>
-            <w:spacing w:before="120" w:after="60"/>
+            <w:spacing w:before="120"/>
             <w:rPr>
               <w:rFonts w:cstheme="majorHAnsi"/>
               <w:b/>
@@ -709,11 +709,11 @@
       </w:tc>
       <w:tc>
         <w:tcPr>
-          <w:tcW w:w="2625" w:type="dxa"/>
+          <w:tcW w:w="2624" w:type="dxa"/>
         </w:tcPr>
         <w:p>
           <w:pPr>
-            <w:spacing w:before="120" w:after="60"/>
+            <w:spacing w:before="120"/>
             <w:rPr>
               <w:rFonts w:cs="Segoe UI"/>
               <w:b/>
@@ -753,11 +753,11 @@
       </w:tc>
       <w:tc>
         <w:tcPr>
-          <w:tcW w:w="2624" w:type="dxa"/>
+          <w:tcW w:w="2623" w:type="dxa"/>
         </w:tcPr>
         <w:p>
           <w:pPr>
-            <w:spacing w:before="120" w:after="60"/>
+            <w:spacing w:before="120"/>
             <w:rPr>
               <w:rFonts w:cs="Segoe UI"/>
               <w:b/>
@@ -797,11 +797,11 @@
       </w:tc>
       <w:tc>
         <w:tcPr>
-          <w:tcW w:w="2625" w:type="dxa"/>
+          <w:tcW w:w="2624" w:type="dxa"/>
         </w:tcPr>
         <w:p>
           <w:pPr>
-            <w:spacing w:before="120" w:after="60"/>
+            <w:spacing w:before="120"/>
             <w:rPr>
               <w:rFonts w:cs="Segoe UI"/>
               <w:b/>
@@ -842,7 +842,7 @@
     </w:tr>
     <w:tr>
       <w:trPr>
-        <w:trHeight w:val="266"/>
+        <w:trHeight w:val="52"/>
       </w:trPr>
       <w:tc>
         <w:tcPr>
@@ -851,7 +851,6 @@
         <w:p>
           <w:pPr>
             <w:pStyle w:val="BCLabel"/>
-            <w:spacing w:after="120"/>
             <w:rPr>
               <w:rFonts w:cstheme="majorHAnsi"/>
               <w:b/>
@@ -902,11 +901,10 @@
       </w:tc>
       <w:tc>
         <w:tcPr>
-          <w:tcW w:w="2625" w:type="dxa"/>
+          <w:tcW w:w="2624" w:type="dxa"/>
         </w:tcPr>
         <w:p>
           <w:pPr>
-            <w:spacing w:after="120"/>
             <w:rPr>
               <w:rFonts w:cstheme="majorHAnsi"/>
               <w:b/>
@@ -943,11 +941,10 @@
       </w:tc>
       <w:tc>
         <w:tcPr>
-          <w:tcW w:w="2624" w:type="dxa"/>
+          <w:tcW w:w="2623" w:type="dxa"/>
         </w:tcPr>
         <w:p>
           <w:pPr>
-            <w:spacing w:after="120"/>
             <w:rPr>
               <w:rFonts w:cstheme="majorHAnsi"/>
               <w:b/>
@@ -998,11 +995,10 @@
       </w:tc>
       <w:tc>
         <w:tcPr>
-          <w:tcW w:w="2625" w:type="dxa"/>
+          <w:tcW w:w="2624" w:type="dxa"/>
         </w:tcPr>
         <w:p>
           <w:pPr>
-            <w:spacing w:after="120"/>
             <w:rPr>
               <w:rFonts w:cstheme="majorHAnsi"/>
               <w:b/>
@@ -1035,6 +1031,28 @@
               </w:r>
             </w:sdtContent>
           </w:sdt>
+        </w:p>
+      </w:tc>
+    </w:tr>
+    <w:tr>
+      <w:trPr>
+        <w:trHeight w:val="52"/>
+      </w:trPr>
+      <w:tc>
+        <w:tcPr>
+          <w:tcW w:w="10495" w:type="dxa"/>
+          <w:gridSpan w:val="4"/>
+        </w:tcPr>
+        <w:p>
+          <w:pPr>
+            <w:spacing w:line="240" w:lineRule="auto"/>
+            <w:rPr>
+              <w:rFonts w:cs="Segoe UI"/>
+              <w:color w:val="242424"/>
+              <w:sz w:val="8"/>
+              <w:szCs w:val="8"/>
+            </w:rPr>
+          </w:pPr>
         </w:p>
       </w:tc>
     </w:tr>
@@ -1080,7 +1098,7 @@
       </w:tc>
       <w:tc>
         <w:tcPr>
-          <w:tcW w:w="2625" w:type="dxa"/>
+          <w:tcW w:w="2624" w:type="dxa"/>
         </w:tcPr>
         <w:p>
           <w:pPr>
@@ -1119,7 +1137,7 @@
       </w:tc>
       <w:tc>
         <w:tcPr>
-          <w:tcW w:w="2624" w:type="dxa"/>
+          <w:tcW w:w="2623" w:type="dxa"/>
         </w:tcPr>
         <w:p>
           <w:pPr>
@@ -1158,7 +1176,7 @@
       </w:tc>
       <w:tc>
         <w:tcPr>
-          <w:tcW w:w="2625" w:type="dxa"/>
+          <w:tcW w:w="2624" w:type="dxa"/>
         </w:tcPr>
         <w:p>
           <w:pPr>
@@ -1247,7 +1265,7 @@
       </w:tc>
       <w:tc>
         <w:tcPr>
-          <w:tcW w:w="2625" w:type="dxa"/>
+          <w:tcW w:w="2624" w:type="dxa"/>
         </w:tcPr>
         <w:p>
           <w:pPr>
@@ -1286,7 +1304,7 @@
       </w:tc>
       <w:tc>
         <w:tcPr>
-          <w:tcW w:w="2624" w:type="dxa"/>
+          <w:tcW w:w="2623" w:type="dxa"/>
         </w:tcPr>
         <w:p>
           <w:pPr>
@@ -1325,7 +1343,7 @@
       </w:tc>
       <w:tc>
         <w:tcPr>
-          <w:tcW w:w="2625" w:type="dxa"/>
+          <w:tcW w:w="2624" w:type="dxa"/>
         </w:tcPr>
         <w:p>
           <w:pPr>
@@ -1434,7 +1452,7 @@
             <w:tag w:val="#BC:InsertDataItem,BCReportInformation/ReportMetadata/ReportCaption"/>
             <w:id w:val="-1105262526"/>
             <w:placeholder>
-              <w:docPart w:val="9351E1828E2647B397589986DFAEE98B"/>
+              <w:docPart w:val="A470FFC2275947AF90A0CCF60903D2DE"/>
             </w:placeholder>
             <w:dataBinding w:prefixMappings="&lt;xmlns:ns0='urn:microsoft-dynamics-nav/reports/Tenant_Report_Defaults/2000000001/' " w:xpath="/ns0:NavWordReportXmlPart[1]/ns0:BCReportInformation[1]/ns0:ReportMetadata[1]/ns0:ReportCaption[1]" w:storeItemID="{00000000-0000-0000-0000-000000000000}"/>
             <w15:color w:val="808080"/>
@@ -1444,6 +1462,7 @@
             <w:p>
               <w:pPr>
                 <w:pStyle w:val="Title"/>
+                <w:spacing w:before="0" w:after="0"/>
                 <w:rPr>
                   <w:rFonts w:ascii="Segoe UI" w:eastAsia="Times New Roman" w:hAnsi="Segoe UI" w:cs="Segoe UI"/>
                   <w:sz w:val="56"/>
@@ -1478,7 +1497,8 @@
             <w:p>
               <w:pPr>
                 <w:pStyle w:val="BCNumber"/>
-                <w:spacing w:after="360"/>
+                <w:spacing w:before="60"/>
+                <w:jc w:val="right"/>
               </w:pPr>
               <w:r>
                 <w:fldChar w:fldCharType="begin"/>
@@ -1551,13 +1571,55 @@
             <w:pStyle w:val="NoSpacing"/>
             <w:jc w:val="right"/>
           </w:pPr>
+          <w:r>
+            <w:t>Friday</w:t>
+          </w:r>
+          <w:r>
+            <w:t>,</w:t>
+          </w:r>
+          <w:r>
+            <w:t xml:space="preserve"> September </w:t>
+          </w:r>
+          <w:r>
+            <w:t>23, 2026</w:t>
+          </w:r>
+        </w:p>
+      </w:tc>
+    </w:tr>
+    <w:tr>
+      <w:trPr>
+        <w:trHeight w:val="80"/>
+      </w:trPr>
+      <w:tc>
+        <w:tcPr>
+          <w:tcW w:w="3302" w:type="pct"/>
+          <w:vMerge/>
+        </w:tcPr>
+        <w:p>
+          <w:pPr>
+            <w:spacing w:before="120"/>
+            <w:rPr>
+              <w:rFonts w:ascii="Aptos" w:eastAsia="Aptos" w:hAnsi="Aptos" w:cs="Times New Roman"/>
+            </w:rPr>
+          </w:pPr>
+        </w:p>
+      </w:tc>
+      <w:tc>
+        <w:tcPr>
+          <w:tcW w:w="1698" w:type="pct"/>
+        </w:tcPr>
+        <w:p>
+          <w:pPr>
+            <w:pStyle w:val="NoSpacing"/>
+            <w:jc w:val="right"/>
+          </w:pPr>
           <w:sdt>
             <w:sdtPr>
               <w:alias w:val="CompanyName"/>
               <w:tag w:val="#BC:InsertDataItem,BCReportInformation/ReportRequest/CompanyName"/>
-              <w:id w:val="975574590"/>
+              <w:id w:val="1327564643"/>
               <w:placeholder>
-                <w:docPart w:val="EFC9E7A090A04250AD62E99527EC3400"/>
+                <w:docPart w:val="AD8251DE783341B48D89D00C46DFB6CF"/>
               </w:placeholder>
               <w:dataBinding w:prefixMappings="&lt;xmlns:ns0='urn:microsoft-dynamics-nav/reports/Tenant_Report_Defaults/2000000001/' " w:xpath="/ns0:NavWordReportXmlPart[1]/ns0:BCReportInformation[1]/ns0:ReportRequest[1]/ns0:CompanyName[1]" w:storeItemID="{00000000-0000-0000-0000-000000000000}"/>
               <w15:color w:val="808080"/>
@@ -1632,7 +1694,6 @@
                   <w:tab w:val="center" w:pos="5310"/>
                   <w:tab w:val="right" w:pos="10440"/>
                 </w:tabs>
-                <w:ind w:right="26"/>
                 <w:rPr>
                   <w:color w:val="242424"/>
                   <w:sz w:val="36"/>
@@ -1670,7 +1731,7 @@
           <w:sdtContent>
             <w:p>
               <w:pPr>
-                <w:spacing w:after="120"/>
+                <w:spacing w:before="60"/>
                 <w:jc w:val="right"/>
                 <w:rPr>
                   <w:color w:val="242424"/>
@@ -3263,7 +3324,6 @@
     <w:uiPriority w:val="1"/>
     <w:semiHidden/>
     <w:unhideWhenUsed/>
-    <w:rsid w:val="008C78C0"/>
   </w:style>
   <w:style w:type="table" w:default="1" w:styleId="TableNormal">
     <w:name w:val="Normal Table"/>
@@ -3285,7 +3345,6 @@
     <w:uiPriority w:val="99"/>
     <w:semiHidden/>
     <w:unhideWhenUsed/>
-    <w:rsid w:val="008C78C0"/>
   </w:style>
   <w:style w:type="table" w:styleId="TableGrid">
     <w:name w:val="Table Grid"/>
@@ -30111,35 +30170,6 @@
         <w:p>
           <w:pPr>
             <w:pStyle w:val="568E8CB4D7A94ED2BC0C28819883F940"/>
-          </w:pPr>
-          <w:r>
-            <w:rPr>
-              <w:rStyle w:val="PlaceholderText"/>
-            </w:rPr>
-            <w:t>Click or tap here to enter text.</w:t>
-          </w:r>
-        </w:p>
-      </w:docPartBody>
-    </w:docPart>
-    <w:docPart>
-      <w:docPartPr>
-        <w:name w:val="9351E1828E2647B397589986DFAEE98B"/>
-        <w:category>
-          <w:name w:val="Generelt"/>
-          <w:gallery w:val="placeholder"/>
-        </w:category>
-        <w:types>
-          <w:type w:val="bbPlcHdr"/>
-        </w:types>
-        <w:behaviors>
-          <w:behavior w:val="content"/>
-        </w:behaviors>
-        <w:guid w:val="{F1578845-B221-4ED7-9F25-9C419199421F}"/>
-      </w:docPartPr>
-      <w:docPartBody>
-        <w:p>
-          <w:pPr>
-            <w:pStyle w:val="9351E1828E2647B397589986DFAEE98B"/>
           </w:pPr>
           <w:r>
             <w:rPr>
@@ -30604,35 +30634,6 @@
     </w:docPart>
     <w:docPart>
       <w:docPartPr>
-        <w:name w:val="EFC9E7A090A04250AD62E99527EC3400"/>
-        <w:category>
-          <w:name w:val="General"/>
-          <w:gallery w:val="placeholder"/>
-        </w:category>
-        <w:types>
-          <w:type w:val="bbPlcHdr"/>
-        </w:types>
-        <w:behaviors>
-          <w:behavior w:val="content"/>
-        </w:behaviors>
-        <w:guid w:val="{41EA72BB-A937-4ADC-9CA6-D8F319D72E92}"/>
-      </w:docPartPr>
-      <w:docPartBody>
-        <w:p>
-          <w:pPr>
-            <w:pStyle w:val="EFC9E7A090A04250AD62E99527EC3400"/>
-          </w:pPr>
-          <w:r>
-            <w:rPr>
-              <w:rStyle w:val="PlaceholderText"/>
-            </w:rPr>
-            <w:t>Click or tap here to enter text.</w:t>
-          </w:r>
-        </w:p>
-      </w:docPartBody>
-    </w:docPart>
-    <w:docPart>
-      <w:docPartPr>
         <w:name w:val="85701054D69D41C2BD908C9148E6F4EB"/>
         <w:category>
           <w:name w:val="General"/>
@@ -30863,6 +30864,64 @@
         </w:p>
       </w:docPartBody>
     </w:docPart>
+    <w:docPart>
+      <w:docPartPr>
+        <w:name w:val="A470FFC2275947AF90A0CCF60903D2DE"/>
+        <w:category>
+          <w:name w:val="General"/>
+          <w:gallery w:val="placeholder"/>
+        </w:category>
+        <w:types>
+          <w:type w:val="bbPlcHdr"/>
+        </w:types>
+        <w:behaviors>
+          <w:behavior w:val="content"/>
+        </w:behaviors>
+        <w:guid w:val="{691ECADA-FE98-48FD-ADAB-644415B52353}"/>
+      </w:docPartPr>
+      <w:docPartBody>
+        <w:p>
+          <w:pPr>
+            <w:pStyle w:val="A470FFC2275947AF90A0CCF60903D2DE"/>
+          </w:pPr>
+          <w:r>
+            <w:rPr>
+              <w:rStyle w:val="PlaceholderText"/>
+            </w:rPr>
+            <w:t>Click or tap here to enter text.</w:t>
+          </w:r>
+        </w:p>
+      </w:docPartBody>
+    </w:docPart>
+    <w:docPart>
+      <w:docPartPr>
+        <w:name w:val="AD8251DE783341B48D89D00C46DFB6CF"/>
+        <w:category>
+          <w:name w:val="General"/>
+          <w:gallery w:val="placeholder"/>
+        </w:category>
+        <w:types>
+          <w:type w:val="bbPlcHdr"/>
+        </w:types>
+        <w:behaviors>
+          <w:behavior w:val="content"/>
+        </w:behaviors>
+        <w:guid w:val="{9F453786-3631-4712-A661-F064FC2A4655}"/>
+      </w:docPartPr>
+      <w:docPartBody>
+        <w:p>
+          <w:pPr>
+            <w:pStyle w:val="AD8251DE783341B48D89D00C46DFB6CF"/>
+          </w:pPr>
+          <w:r>
+            <w:rPr>
+              <w:rStyle w:val="PlaceholderText"/>
+            </w:rPr>
+            <w:t>Click or tap here to enter text.</w:t>
+          </w:r>
+        </w:p>
+      </w:docPartBody>
+    </w:docPart>
   </w:docParts>
 </w:glossaryDocument>
 </file>
@@ -30919,12 +30978,14 @@
     <w:sig w:usb0="E4002EFF" w:usb1="C000E47F" w:usb2="00000009" w:usb3="00000000" w:csb0="000001FF" w:csb1="00000000"/>
   </w:font>
   <w:font w:name="Aptos">
+    <w:panose1 w:val="020B0004020202020204"/>
     <w:charset w:val="00"/>
     <w:family w:val="swiss"/>
     <w:pitch w:val="variable"/>
     <w:sig w:usb0="20000287" w:usb1="00000003" w:usb2="00000000" w:usb3="00000000" w:csb0="0000019F" w:csb1="00000000"/>
   </w:font>
   <w:font w:name="Aptos Display">
+    <w:panose1 w:val="020B0004020202020204"/>
     <w:charset w:val="00"/>
     <w:family w:val="swiss"/>
     <w:pitch w:val="variable"/>
@@ -30957,6 +31018,7 @@
     <w:rsid w:val="0009355D"/>
     <w:rsid w:val="001024DE"/>
     <w:rsid w:val="001024F7"/>
+    <w:rsid w:val="00107F6B"/>
     <w:rsid w:val="00133336"/>
     <w:rsid w:val="00184BAF"/>
     <w:rsid w:val="001A2258"/>
@@ -31007,6 +31069,7 @@
     <w:rsid w:val="0080614B"/>
     <w:rsid w:val="00822ACB"/>
     <w:rsid w:val="00825186"/>
+    <w:rsid w:val="0087642A"/>
     <w:rsid w:val="0089757A"/>
     <w:rsid w:val="008A720C"/>
     <w:rsid w:val="008C225B"/>
@@ -31033,6 +31096,7 @@
     <w:rsid w:val="00BF27CE"/>
     <w:rsid w:val="00C03606"/>
     <w:rsid w:val="00C224B4"/>
+    <w:rsid w:val="00C32F6B"/>
     <w:rsid w:val="00CB7A61"/>
     <w:rsid w:val="00CB7A74"/>
     <w:rsid w:val="00CC7327"/>
@@ -31504,7 +31568,7 @@
     <w:basedOn w:val="DefaultParagraphFont"/>
     <w:uiPriority w:val="99"/>
     <w:semiHidden/>
-    <w:rsid w:val="0055153E"/>
+    <w:rsid w:val="00C32F6B"/>
     <w:rPr>
       <w:color w:val="808080"/>
     </w:rPr>
@@ -31817,6 +31881,62 @@
       <w:kern w:val="2"/>
       <w:sz w:val="24"/>
       <w:szCs w:val="24"/>
+      <w14:ligatures w14:val="standardContextual"/>
+    </w:rPr>
+  </w:style>
+  <w:style w:type="paragraph" w:customStyle="1" w:styleId="DA23F7B6FEFE4123804DF6120FC699C1">
+    <w:name w:val="DA23F7B6FEFE4123804DF6120FC699C1"/>
+    <w:rsid w:val="00C32F6B"/>
+    <w:pPr>
+      <w:spacing w:line="278" w:lineRule="auto"/>
+    </w:pPr>
+    <w:rPr>
+      <w:kern w:val="2"/>
+      <w:sz w:val="24"/>
+      <w:szCs w:val="24"/>
+      <w:lang w:val="en-DK" w:eastAsia="en-DK"/>
+      <w14:ligatures w14:val="standardContextual"/>
+    </w:rPr>
+  </w:style>
+  <w:style w:type="paragraph" w:customStyle="1" w:styleId="A470FFC2275947AF90A0CCF60903D2DE">
+    <w:name w:val="A470FFC2275947AF90A0CCF60903D2DE"/>
+    <w:rsid w:val="00C32F6B"/>
+    <w:pPr>
+      <w:spacing w:line="278" w:lineRule="auto"/>
+    </w:pPr>
+    <w:rPr>
+      <w:kern w:val="2"/>
+      <w:sz w:val="24"/>
+      <w:szCs w:val="24"/>
+      <w:lang w:val="en-DK" w:eastAsia="en-DK"/>
+      <w14:ligatures w14:val="standardContextual"/>
+    </w:rPr>
+  </w:style>
+  <w:style w:type="paragraph" w:customStyle="1" w:styleId="692B9BB1C04C471EB89905D584C97CF4">
+    <w:name w:val="692B9BB1C04C471EB89905D584C97CF4"/>
+    <w:rsid w:val="00C32F6B"/>
+    <w:pPr>
+      <w:spacing w:line="278" w:lineRule="auto"/>
+    </w:pPr>
+    <w:rPr>
+      <w:kern w:val="2"/>
+      <w:sz w:val="24"/>
+      <w:szCs w:val="24"/>
+      <w:lang w:val="en-DK" w:eastAsia="en-DK"/>
+      <w14:ligatures w14:val="standardContextual"/>
+    </w:rPr>
+  </w:style>
+  <w:style w:type="paragraph" w:customStyle="1" w:styleId="AD8251DE783341B48D89D00C46DFB6CF">
+    <w:name w:val="AD8251DE783341B48D89D00C46DFB6CF"/>
+    <w:rsid w:val="00C32F6B"/>
+    <w:pPr>
+      <w:spacing w:line="278" w:lineRule="auto"/>
+    </w:pPr>
+    <w:rPr>
+      <w:kern w:val="2"/>
+      <w:sz w:val="24"/>
+      <w:szCs w:val="24"/>
+      <w:lang w:val="en-DK" w:eastAsia="en-DK"/>
       <w14:ligatures w14:val="standardContextual"/>
     </w:rPr>
   </w:style>
@@ -32093,7 +32213,7 @@
 
 <file path=word/webextensions/taskpanes.xml><?xml version="1.0" encoding="utf-8"?>
 <wetp:taskpanes xmlns:wetp="http://schemas.microsoft.com/office/webextensions/taskpanes/2010/11">
-  <wetp:taskpane dockstate="right" visibility="0" width="350" row="7">
+  <wetp:taskpane dockstate="right" visibility="0" width="350" row="8">
     <wetp:webextensionref xmlns:r="http://schemas.openxmlformats.org/officeDocument/2006/relationships" r:id="rId1"/>
   </wetp:taskpane>
 </wetp:taskpanes>
@@ -32112,6 +32232,10 @@
 </file>
 
 <file path=customXml/item1.xml><?xml version="1.0" encoding="utf-8"?>
+<b:Sources xmlns:b="http://schemas.openxmlformats.org/officeDocument/2006/bibliography" xmlns="http://schemas.openxmlformats.org/officeDocument/2006/bibliography" SelectedStyle="\APASixthEditionOfficeOnline.xsl" StyleName="APA" Version="6"/>
+</file>
+
+<file path=customXml/item2.xml><?xml version="1.0" encoding="utf-8"?>
 <ct:contentTypeSchema xmlns:ct="http://schemas.microsoft.com/office/2006/metadata/contentType" xmlns:ma="http://schemas.microsoft.com/office/2006/metadata/properties/metaAttributes" ct:_="" ma:_="" ma:contentTypeName="Document" ma:contentTypeID="0x0101001DCAE6B6EBFA5442B0B9E84E60AFF245" ma:contentTypeVersion="18" ma:contentTypeDescription="Create a new document." ma:contentTypeScope="" ma:versionID="69eec3b24558e1297a79cd42e69b0397">
   <xsd:schema xmlns:xsd="http://www.w3.org/2001/XMLSchema" xmlns:xs="http://www.w3.org/2001/XMLSchema" xmlns:p="http://schemas.microsoft.com/office/2006/metadata/properties" xmlns:ns1="http://schemas.microsoft.com/sharepoint/v3" xmlns:ns2="178f68d8-b893-4efd-8406-fab0f21873e4" xmlns:ns3="b83e059f-de16-406c-a902-3d56d4e79ec8" targetNamespace="http://schemas.microsoft.com/office/2006/metadata/properties" ma:root="true" ma:fieldsID="0f52a3acd42ec0bd0d267ba89c916a39" ns1:_="" ns2:_="" ns3:_="">
     <xsd:import namespace="http://schemas.microsoft.com/sharepoint/v3"/>
@@ -32377,169 +32501,23 @@
 </ct:contentTypeSchema>
 </file>
 
-<file path=customXml/item2.xml><?xml version="1.0" encoding="utf-8"?>
-<b:Sources xmlns:b="http://schemas.openxmlformats.org/officeDocument/2006/bibliography" xmlns="http://schemas.openxmlformats.org/officeDocument/2006/bibliography" SelectedStyle="\APASixthEditionOfficeOnline.xsl" StyleName="APA" Version="6"/>
+<file path=customXml/item3.xml><?xml version="1.0" encoding="utf-8"?>
+<p:properties xmlns:p="http://schemas.microsoft.com/office/2006/metadata/properties" xmlns:xsi="http://www.w3.org/2001/XMLSchema-instance" xmlns:pc="http://schemas.microsoft.com/office/infopath/2007/PartnerControls">
+  <documentManagement>
+    <Package xmlns="178f68d8-b893-4efd-8406-fab0f21873e4" xsi:nil="true"/>
+    <lcf76f155ced4ddcb4097134ff3c332f xmlns="178f68d8-b893-4efd-8406-fab0f21873e4">
+      <Terms xmlns="http://schemas.microsoft.com/office/infopath/2007/PartnerControls"/>
+    </lcf76f155ced4ddcb4097134ff3c332f>
+    <_ip_UnifiedCompliancePolicyUIAction xmlns="http://schemas.microsoft.com/sharepoint/v3" xsi:nil="true"/>
+    <TaxCatchAll xmlns="b83e059f-de16-406c-a902-3d56d4e79ec8" xsi:nil="true"/>
+    <Audience xmlns="178f68d8-b893-4efd-8406-fab0f21873e4" xsi:nil="true"/>
+    <_ip_UnifiedCompliancePolicyProperties xmlns="http://schemas.microsoft.com/sharepoint/v3" xsi:nil="true"/>
+    <DocumentType xmlns="178f68d8-b893-4efd-8406-fab0f21873e4" xsi:nil="true"/>
+  </documentManagement>
+</p:properties>
 </file>
 
-<file path=customXml/item3.xml>��< ? x m l   v e r s i o n = " 1 . 0 "   e n c o d i n g = " u t f - 1 6 " ? > < N a v W o r d R e p o r t X m l P a r t   x m l n s = " u r n : m i c r o s o f t - d y n a m i c s - n a v / r e p o r t s / T e n a n t _ R e p o r t _ D e f a u l t s / 2 0 0 0 0 0 0 0 0 1 / " > - 
-     < B C R e p o r t I n f o r m a t i o n > - 
-         < R e p o r t M e t a d a t a > - 
-             < E x t e n s i o n I d > E x t e n s i o n   I D < / E x t e n s i o n I d > - 
-             < E x t e n s i o n N a m e > E x t e n s i o n   N a m e < / E x t e n s i o n N a m e > - 
-             < E x t e n s i o n P u b l i s h e r > E x t e n s i o n   P u b l i s h e r < / E x t e n s i o n P u b l i s h e r > - 
-             < E x t e n s i o n V e r s i o n > E x t e n s i o n   V e r s i o n < / E x t e n s i o n V e r s i o n > - 
-             < R e p o r t I d > R e p o r t   I D < / R e p o r t I d > - 
-             < R e p o r t N a m e > R e p o r t   N a m e < / R e p o r t N a m e > - 
-             < R e p o r t C a p t i o n > R e p o r t   C a p t i o n < / R e p o r t C a p t i o n > - 
-             < A b o u t T h i s R e p o r t T i t l e > A b o u t   T h i s   R e p o r t   T i t l e < / A b o u t T h i s R e p o r t T i t l e > - 
-             < A b o u t T h i s R e p o r t T e x t > A b o u t   T h i s   R e p o r t   T e x t < / A b o u t T h i s R e p o r t T e x t > - 
-             < R e p o r t H e l p L i n k > R e p o r t   H e l p   L i n k < / R e p o r t H e l p L i n k > - 
-         < / R e p o r t M e t a d a t a > - 
-         < R e p o r t R e q u e s t > - 
-             < T e n a n t E n t r a I d > T e n a n t   E n t r a   I d < / T e n a n t E n t r a I d > - 
-             < E n v i r o n m e n t N a m e > E n v i r o n m e n t   N a m e < / E n v i r o n m e n t N a m e > - 
-             < E n v i r o n m e n t T y p e > E n v i r o n m e n t   T y p e < / E n v i r o n m e n t T y p e > - 
-             < C o m p a n y N a m e > C o m p a n y   N a m e < / C o m p a n y N a m e > - 
-             < C o m p a n y D i s p l a y N a m e > C o m p a n y   D i s p l a y   N a m e < / C o m p a n y D i s p l a y N a m e > - 
-             < C o m p a n y I d > C o m p a n y   I D < / C o m p a n y I d > - 
-             < U s e r N a m e > U s e r   N a m e < / U s e r N a m e > - 
-             < D a t e A n d T i m e > D a t e   a n d   T i m e < / D a t e A n d T i m e > - 
-             < L a n g u a g e > L a n g u a g e < / L a n g u a g e > - 
-             < F o r m a t R e g i o n > F o r m a t   R e g i o n < / F o r m a t R e g i o n > - 
-             < D a t e T i m e V a l u e s > - 
-                 < Y e a r > Y e a r < / Y e a r > - 
-                 < M o n t h N u m b e r > M o n t h   N u m b e r < / M o n t h N u m b e r > - 
-                 < D a y N u m b e r > D a y   N u m b e r < / D a y N u m b e r > - 
-                 < H o u r > H o u r < / H o u r > - 
-                 < M i n u t e > M i n u t e < / M i n u t e > - 
-             < / D a t e T i m e V a l u e s > - 
-         < / R e p o r t R e q u e s t > - 
-         < C o m p a n y M e t a d a t a > - 
-             < C o m p a n y N a m e > C o m p a n y   N a m e < / C o m p a n y N a m e > - 
-             < C o m p a n y D i s p l a y N a m e > C o m p a n y   D i s p l a y   N a m e < / C o m p a n y D i s p l a y N a m e > - 
-             < C o m p a n y A d d r e s s L i n e s > - 
-                 < C o m p a n y A d d r e s s L i n e 1 > C o m p a n y   A d d r e s s   L i n e   1 < / C o m p a n y A d d r e s s L i n e 1 > - 
-                 < C o m p a n y A d d r e s s L i n e 2 > C o m p a n y   A d d r e s s   L i n e   2 < / C o m p a n y A d d r e s s L i n e 2 > - 
-                 < C o m p a n y A d d r e s s L i n e 3 > C o m p a n y   A d d r e s s   L i n e   3 < / C o m p a n y A d d r e s s L i n e 3 > - 
-                 < C o m p a n y A d d r e s s L i n e 4 > C o m p a n y   A d d r e s s   L i n e   4 < / C o m p a n y A d d r e s s L i n e 4 > - 
-                 < C o m p a n y A d d r e s s L i n e 5 > C o m p a n y   A d d r e s s   L i n e   5 < / C o m p a n y A d d r e s s L i n e 5 > - 
-                 < C o m p a n y A d d r e s s L i n e 6 > C o m p a n y   A d d r e s s   L i n e   6 < / C o m p a n y A d d r e s s L i n e 6 > - 
-                 < C o m p a n y A d d r e s s L i n e 7 > C o m p a n y   A d d r e s s   L i n e   7 < / C o m p a n y A d d r e s s L i n e 7 > - 
-                 < C o m p a n y A d d r e s s L i n e 8 > C o m p a n y   A d d r e s s   L i n e   8 < / C o m p a n y A d d r e s s L i n e 8 > - 
-             < / C o m p a n y A d d r e s s L i n e s > - 
-             < C o m p a n y P h o n e > C o m p a n y   P h o n e < / C o m p a n y P h o n e > - 
-             < C o m p a n y P h o n e C a p t i o n > C o m p a n y   P h o n e   C a p t i o n < / C o m p a n y P h o n e C a p t i o n > - 
-             < C o m p a n y F a x N o > C o m p a n y   F a x   N o . < / C o m p a n y F a x N o > - 
-             < C o m p a n y F a x N o C a p t i o n > C o m p a n y   F a x   N o .   C a p t i o n < / C o m p a n y F a x N o C a p t i o n > - 
-             < C o m p a n y E m a i l > C o m p a n y   E m a i l < / C o m p a n y E m a i l > - 
-             < C o m p a n y E m a i l C a p t i o n > C o m p a n y   E m a i l   C a p t i o n < / C o m p a n y E m a i l C a p t i o n > - 
-             < C o m p a n y H o m e P a g e > C o m p a n y   H o m e   P a g e < / C o m p a n y H o m e P a g e > - 
-             < C o m p a n y H o m e P a g e C a p t i o n > C o m p a n y   H o m e   P a g e   C a p t i o n < / C o m p a n y H o m e P a g e C a p t i o n > - 
-             < C o m p a n y L o g o > C o m p a n y   L o g o < / C o m p a n y L o g o > - 
-             < C o m p a n y V A T R e g i s t r a t i o n N o > C o m p a n y   V A T   R e g i s t r a t i o n   N o . < / C o m p a n y V A T R e g i s t r a t i o n N o > - 
-             < C o m p a n y V A T R e g i s t r a t i o n N o C a p t i o n > C o m p a n y   V A T   R e g i s t r a t i o n   N o .   C a p t i o n < / C o m p a n y V A T R e g i s t r a t i o n N o C a p t i o n > - 
-             < C o m p a n y R e g i s t r a t i o n N o > C o m p a n y   R e g i s t r a t i o n   N o . < / C o m p a n y R e g i s t r a t i o n N o > - 
-             < C o m p a n y R e g i s t r a t i o n N o C a p t i o n > C o m p a n y   R e g i s t r a t i o n   N o .   C a p t i o n < / C o m p a n y R e g i s t r a t i o n N o C a p t i o n > - 
-             < C o m p a n y B a n k N a m e > C o m p a n y   B a n k   N a m e < / C o m p a n y B a n k N a m e > - 
-             < C o m p a n y B a n k N a m e C a p t i o n > C o m p a n y   B a n k   N a m e   C a p t i o n < / C o m p a n y B a n k N a m e C a p t i o n > - 
-             < C o m p a n y B a n k A c c o u n t N o > C o m p a n y   B a n k   A c c o u n t   N o . < / C o m p a n y B a n k A c c o u n t N o > - 
-             < C o m p a n y B a n k A c c o u n t N o C a p t i o n > C o m p a n y   B a n k   A c c o u n t   N o .   C a p t i o n < / C o m p a n y B a n k A c c o u n t N o C a p t i o n > - 
-             < C o m p a n y B a n k B r a n c h N o > C o m p a n y   B a n k   B r a n c h   N o . < / C o m p a n y B a n k B r a n c h N o > - 
-             < C o m p a n y B a n k B r a n c h N o C a p t i o n > C o m p a n y   B a n k   B r a n c h   N o .   C a p t i o n < / C o m p a n y B a n k B r a n c h N o C a p t i o n > - 
-             < C o m p a n y I B A N > C o m p a n y   I B A N < / C o m p a n y I B A N > - 
-             < C o m p a n y I B A N C a p t i o n > C o m p a n y   I B A N   C a p t i o n < / C o m p a n y I B A N C a p t i o n > - 
-             < C o m p a n y B a n k S W I F T > C o m p a n y   B a n k   S W I F T < / C o m p a n y B a n k S W I F T > - 
-             < C o m p a n y B a n k S W I F T C a p t i o n > C o m p a n y   B a n k   S W I F T   C a p t i o n < / C o m p a n y B a n k S W I F T C a p t i o n > - 
-             < C o m p a n y G i r o N o > C o m p a n y   G i r o   N o . < / C o m p a n y G i r o N o > - 
-             < C o m p a n y G i r o N o C a p t i o n > C o m p a n y   G i r o   N o .   C a p t i o n < / C o m p a n y G i r o N o C a p t i o n > - 
-         < / C o m p a n y M e t a d a t a > - 
-     < / B C R e p o r t I n f o r m a t i o n > - 
- < / N a v W o r d R e p o r t X m l P a r t > 
-</file>
-
-<file path=customXml/item4.xml><?xml version="1.0" encoding="utf-8"?>
-<?mso-contentType ?>
-<FormTemplates xmlns="http://schemas.microsoft.com/sharepoint/v3/contenttype/forms">
-  <Display>DocumentLibraryForm</Display>
-  <Edit>DocumentLibraryForm</Edit>
-  <New>DocumentLibraryForm</New>
-</FormTemplates>
-</file>
-
-<file path=customXml/item5.xml>��< ? x m l   v e r s i o n = " 1 . 0 "   e n c o d i n g = " u t f - 1 6 " ? > < N a v W o r d R e p o r t X m l P a r t   x m l n s = " u r n : m i c r o s o f t - d y n a m i c s - b u s i n e s s c e n t r a l / i n t e r n a l / e x t e n d e d / r e p o r t s / T e n a n t _ R e p o r t _ D e f a u l t s / 2 0 0 0 0 0 0 0 0 1 / " > +<file path=customXml/item4.xml>��< ? x m l   v e r s i o n = " 1 . 0 "   e n c o d i n g = " u t f - 1 6 " ? > < N a v W o r d R e p o r t X m l P a r t   x m l n s = " u r n : m i c r o s o f t - d y n a m i c s - b u s i n e s s c e n t r a l / i n t e r n a l / e x t e n d e d / r e p o r t s / T e n a n t _ R e p o r t _ D e f a u l t s / 2 0 0 0 0 0 0 0 0 1 / " >   
      < B C R e p o r t I n f o r m a t i o n >   
@@ -32690,23 +32668,173 @@
  < / N a v W o r d R e p o r t X m l P a r t > 
 </file>
 
-<file path=customXml/item6.xml><?xml version="1.0" encoding="utf-8"?>
-<p:properties xmlns:p="http://schemas.microsoft.com/office/2006/metadata/properties" xmlns:xsi="http://www.w3.org/2001/XMLSchema-instance" xmlns:pc="http://schemas.microsoft.com/office/infopath/2007/PartnerControls">
-  <documentManagement>
-    <Package xmlns="178f68d8-b893-4efd-8406-fab0f21873e4" xsi:nil="true"/>
-    <lcf76f155ced4ddcb4097134ff3c332f xmlns="178f68d8-b893-4efd-8406-fab0f21873e4">
-      <Terms xmlns="http://schemas.microsoft.com/office/infopath/2007/PartnerControls"/>
-    </lcf76f155ced4ddcb4097134ff3c332f>
-    <_ip_UnifiedCompliancePolicyUIAction xmlns="http://schemas.microsoft.com/sharepoint/v3" xsi:nil="true"/>
-    <TaxCatchAll xmlns="b83e059f-de16-406c-a902-3d56d4e79ec8" xsi:nil="true"/>
-    <Audience xmlns="178f68d8-b893-4efd-8406-fab0f21873e4" xsi:nil="true"/>
-    <_ip_UnifiedCompliancePolicyProperties xmlns="http://schemas.microsoft.com/sharepoint/v3" xsi:nil="true"/>
-    <DocumentType xmlns="178f68d8-b893-4efd-8406-fab0f21873e4" xsi:nil="true"/>
-  </documentManagement>
-</p:properties>
+<file path=customXml/item5.xml><?xml version="1.0" encoding="utf-8"?>
+<?mso-contentType ?>
+<FormTemplates xmlns="http://schemas.microsoft.com/sharepoint/v3/contenttype/forms">
+  <Display>DocumentLibraryForm</Display>
+  <Edit>DocumentLibraryForm</Edit>
+  <New>DocumentLibraryForm</New>
+</FormTemplates>
+</file>
+
+<file path=customXml/item6.xml>��< ? x m l   v e r s i o n = " 1 . 0 "   e n c o d i n g = " u t f - 1 6 " ? > < N a v W o r d R e p o r t X m l P a r t   x m l n s = " u r n : m i c r o s o f t - d y n a m i c s - n a v / r e p o r t s / T e n a n t _ R e p o r t _ D e f a u l t s / 2 0 0 0 0 0 0 0 0 1 / " > + 
+     < B C R e p o r t I n f o r m a t i o n > + 
+         < R e p o r t M e t a d a t a > + 
+             < E x t e n s i o n I d > E x t e n s i o n   I D < / E x t e n s i o n I d > + 
+             < E x t e n s i o n N a m e > E x t e n s i o n   N a m e < / E x t e n s i o n N a m e > + 
+             < E x t e n s i o n P u b l i s h e r > E x t e n s i o n   P u b l i s h e r < / E x t e n s i o n P u b l i s h e r > + 
+             < E x t e n s i o n V e r s i o n > E x t e n s i o n   V e r s i o n < / E x t e n s i o n V e r s i o n > + 
+             < R e p o r t I d > R e p o r t   I D < / R e p o r t I d > + 
+             < R e p o r t N a m e > R e p o r t   N a m e < / R e p o r t N a m e > + 
+             < R e p o r t C a p t i o n > R e p o r t   C a p t i o n < / R e p o r t C a p t i o n > + 
+             < A b o u t T h i s R e p o r t T i t l e > A b o u t   T h i s   R e p o r t   T i t l e < / A b o u t T h i s R e p o r t T i t l e > + 
+             < A b o u t T h i s R e p o r t T e x t > A b o u t   T h i s   R e p o r t   T e x t < / A b o u t T h i s R e p o r t T e x t > + 
+             < R e p o r t H e l p L i n k > R e p o r t   H e l p   L i n k < / R e p o r t H e l p L i n k > + 
+         < / R e p o r t M e t a d a t a > + 
+         < R e p o r t R e q u e s t > + 
+             < T e n a n t E n t r a I d > T e n a n t   E n t r a   I d < / T e n a n t E n t r a I d > + 
+             < E n v i r o n m e n t N a m e > E n v i r o n m e n t   N a m e < / E n v i r o n m e n t N a m e > + 
+             < E n v i r o n m e n t T y p e > E n v i r o n m e n t   T y p e < / E n v i r o n m e n t T y p e > + 
+             < C o m p a n y N a m e > C o m p a n y   N a m e < / C o m p a n y N a m e > + 
+             < C o m p a n y D i s p l a y N a m e > C o m p a n y   D i s p l a y   N a m e < / C o m p a n y D i s p l a y N a m e > + 
+             < C o m p a n y I d > C o m p a n y   I D < / C o m p a n y I d > + 
+             < U s e r N a m e > U s e r   N a m e < / U s e r N a m e > + 
+             < D a t e A n d T i m e > D a t e   a n d   T i m e < / D a t e A n d T i m e > + 
+             < L a n g u a g e > L a n g u a g e < / L a n g u a g e > + 
+             < F o r m a t R e g i o n > F o r m a t   R e g i o n < / F o r m a t R e g i o n > + 
+             < D a t e T i m e V a l u e s > + 
+                 < Y e a r > Y e a r < / Y e a r > + 
+                 < M o n t h N u m b e r > M o n t h   N u m b e r < / M o n t h N u m b e r > + 
+                 < D a y N u m b e r > D a y   N u m b e r < / D a y N u m b e r > + 
+                 < H o u r > H o u r < / H o u r > + 
+                 < M i n u t e > M i n u t e < / M i n u t e > + 
+             < / D a t e T i m e V a l u e s > + 
+         < / R e p o r t R e q u e s t > + 
+         < C o m p a n y M e t a d a t a > + 
+             < C o m p a n y N a m e > C o m p a n y   N a m e < / C o m p a n y N a m e > + 
+             < C o m p a n y D i s p l a y N a m e > C o m p a n y   D i s p l a y   N a m e < / C o m p a n y D i s p l a y N a m e > + 
+             < C o m p a n y A d d r e s s L i n e s > + 
+                 < C o m p a n y A d d r e s s L i n e 1 > C o m p a n y   A d d r e s s   L i n e   1 < / C o m p a n y A d d r e s s L i n e 1 > + 
+                 < C o m p a n y A d d r e s s L i n e 2 > C o m p a n y   A d d r e s s   L i n e   2 < / C o m p a n y A d d r e s s L i n e 2 > + 
+                 < C o m p a n y A d d r e s s L i n e 3 > C o m p a n y   A d d r e s s   L i n e   3 < / C o m p a n y A d d r e s s L i n e 3 > + 
+                 < C o m p a n y A d d r e s s L i n e 4 > C o m p a n y   A d d r e s s   L i n e   4 < / C o m p a n y A d d r e s s L i n e 4 > + 
+                 < C o m p a n y A d d r e s s L i n e 5 > C o m p a n y   A d d r e s s   L i n e   5 < / C o m p a n y A d d r e s s L i n e 5 > + 
+                 < C o m p a n y A d d r e s s L i n e 6 > C o m p a n y   A d d r e s s   L i n e   6 < / C o m p a n y A d d r e s s L i n e 6 > + 
+                 < C o m p a n y A d d r e s s L i n e 7 > C o m p a n y   A d d r e s s   L i n e   7 < / C o m p a n y A d d r e s s L i n e 7 > + 
+                 < C o m p a n y A d d r e s s L i n e 8 > C o m p a n y   A d d r e s s   L i n e   8 < / C o m p a n y A d d r e s s L i n e 8 > + 
+             < / C o m p a n y A d d r e s s L i n e s > + 
+             < C o m p a n y P h o n e > C o m p a n y   P h o n e < / C o m p a n y P h o n e > + 
+             < C o m p a n y P h o n e C a p t i o n > C o m p a n y   P h o n e   C a p t i o n < / C o m p a n y P h o n e C a p t i o n > + 
+             < C o m p a n y F a x N o > C o m p a n y   F a x   N o . < / C o m p a n y F a x N o > + 
+             < C o m p a n y F a x N o C a p t i o n > C o m p a n y   F a x   N o .   C a p t i o n < / C o m p a n y F a x N o C a p t i o n > + 
+             < C o m p a n y E m a i l > C o m p a n y   E m a i l < / C o m p a n y E m a i l > + 
+             < C o m p a n y E m a i l C a p t i o n > C o m p a n y   E m a i l   C a p t i o n < / C o m p a n y E m a i l C a p t i o n > + 
+             < C o m p a n y H o m e P a g e > C o m p a n y   H o m e   P a g e < / C o m p a n y H o m e P a g e > + 
+             < C o m p a n y H o m e P a g e C a p t i o n > C o m p a n y   H o m e   P a g e   C a p t i o n < / C o m p a n y H o m e P a g e C a p t i o n > + 
+             < C o m p a n y L o g o > C o m p a n y   L o g o < / C o m p a n y L o g o > + 
+             < C o m p a n y V A T R e g i s t r a t i o n N o > C o m p a n y   V A T   R e g i s t r a t i o n   N o . < / C o m p a n y V A T R e g i s t r a t i o n N o > + 
+             < C o m p a n y V A T R e g i s t r a t i o n N o C a p t i o n > C o m p a n y   V A T   R e g i s t r a t i o n   N o .   C a p t i o n < / C o m p a n y V A T R e g i s t r a t i o n N o C a p t i o n > + 
+             < C o m p a n y R e g i s t r a t i o n N o > C o m p a n y   R e g i s t r a t i o n   N o . < / C o m p a n y R e g i s t r a t i o n N o > + 
+             < C o m p a n y R e g i s t r a t i o n N o C a p t i o n > C o m p a n y   R e g i s t r a t i o n   N o .   C a p t i o n < / C o m p a n y R e g i s t r a t i o n N o C a p t i o n > + 
+             < C o m p a n y B a n k N a m e > C o m p a n y   B a n k   N a m e < / C o m p a n y B a n k N a m e > + 
+             < C o m p a n y B a n k N a m e C a p t i o n > C o m p a n y   B a n k   N a m e   C a p t i o n < / C o m p a n y B a n k N a m e C a p t i o n > + 
+             < C o m p a n y B a n k A c c o u n t N o > C o m p a n y   B a n k   A c c o u n t   N o . < / C o m p a n y B a n k A c c o u n t N o > + 
+             < C o m p a n y B a n k A c c o u n t N o C a p t i o n > C o m p a n y   B a n k   A c c o u n t   N o .   C a p t i o n < / C o m p a n y B a n k A c c o u n t N o C a p t i o n > + 
+             < C o m p a n y B a n k B r a n c h N o > C o m p a n y   B a n k   B r a n c h   N o . < / C o m p a n y B a n k B r a n c h N o > + 
+             < C o m p a n y B a n k B r a n c h N o C a p t i o n > C o m p a n y   B a n k   B r a n c h   N o .   C a p t i o n < / C o m p a n y B a n k B r a n c h N o C a p t i o n > + 
+             < C o m p a n y I B A N > C o m p a n y   I B A N < / C o m p a n y I B A N > + 
+             < C o m p a n y I B A N C a p t i o n > C o m p a n y   I B A N   C a p t i o n < / C o m p a n y I B A N C a p t i o n > + 
+             < C o m p a n y B a n k S W I F T > C o m p a n y   B a n k   S W I F T < / C o m p a n y B a n k S W I F T > + 
+             < C o m p a n y B a n k S W I F T C a p t i o n > C o m p a n y   B a n k   S W I F T   C a p t i o n < / C o m p a n y B a n k S W I F T C a p t i o n > + 
+             < C o m p a n y G i r o N o > C o m p a n y   G i r o   N o . < / C o m p a n y G i r o N o > + 
+             < C o m p a n y G i r o N o C a p t i o n > C o m p a n y   G i r o   N o .   C a p t i o n < / C o m p a n y G i r o N o C a p t i o n > + 
+         < / C o m p a n y M e t a d a t a > + 
+     < / B C R e p o r t I n f o r m a t i o n > + 
+ < / N a v W o r d R e p o r t X m l P a r t > 
 </file>
 
 <file path=customXml/itemProps1.xml><?xml version="1.0" encoding="utf-8"?>
+<ds:datastoreItem xmlns:ds="http://schemas.openxmlformats.org/officeDocument/2006/customXml" ds:itemID="{89DB96BF-8133-438A-AAD3-A3C21079AEB1}">
+  <ds:schemaRefs>
+    <ds:schemaRef ds:uri="http://schemas.openxmlformats.org/officeDocument/2006/bibliography"/>
+  </ds:schemaRefs>
+</ds:datastoreItem>
+</file>
+
+<file path=customXml/itemProps2.xml><?xml version="1.0" encoding="utf-8"?>
 <ds:datastoreItem xmlns:ds="http://schemas.openxmlformats.org/officeDocument/2006/customXml" ds:itemID="{0FFE40E4-CA26-441C-A1D4-EB398D712217}">
   <ds:schemaRefs>
     <ds:schemaRef ds:uri="http://schemas.microsoft.com/office/2006/metadata/contentType"/>
@@ -32726,39 +32854,7 @@
 </ds:datastoreItem>
 </file>
 
-<file path=customXml/itemProps2.xml><?xml version="1.0" encoding="utf-8"?>
-<ds:datastoreItem xmlns:ds="http://schemas.openxmlformats.org/officeDocument/2006/customXml" ds:itemID="{89DB96BF-8133-438A-AAD3-A3C21079AEB1}">
-  <ds:schemaRefs>
-    <ds:schemaRef ds:uri="http://schemas.openxmlformats.org/officeDocument/2006/bibliography"/>
-  </ds:schemaRefs>
-</ds:datastoreItem>
-</file>
-
 <file path=customXml/itemProps3.xml><?xml version="1.0" encoding="utf-8"?>
-<ds:datastoreItem xmlns:ds="http://schemas.openxmlformats.org/officeDocument/2006/customXml" ds:itemID="{20B1C7BE-CC2E-41B2-B1D5-B0B8F36428EB}">
-  <ds:schemaRefs>
-    <ds:schemaRef ds:uri="urn:microsoft-dynamics-nav/reports/Tenant_Report_Defaults/2000000001/"/>
-  </ds:schemaRefs>
-</ds:datastoreItem>
-</file>
-
-<file path=customXml/itemProps4.xml><?xml version="1.0" encoding="utf-8"?>
-<ds:datastoreItem xmlns:ds="http://schemas.openxmlformats.org/officeDocument/2006/customXml" ds:itemID="{7AEC2198-F042-4C71-9FA1-0766E4DE10D1}">
-  <ds:schemaRefs>
-    <ds:schemaRef ds:uri="http://schemas.microsoft.com/sharepoint/v3/contenttype/forms"/>
-  </ds:schemaRefs>
-</ds:datastoreItem>
-</file>
-
-<file path=customXml/itemProps5.xml><?xml version="1.0" encoding="utf-8"?>
-<ds:datastoreItem xmlns:ds="http://schemas.openxmlformats.org/officeDocument/2006/customXml" ds:itemID="{E02279C7-2801-4BF1-B032-710495FC8DAA}">
-  <ds:schemaRefs>
-    <ds:schemaRef ds:uri="urn:microsoft-dynamics-businesscentral/internal/extended/reports/Tenant_Report_Defaults/2000000001/"/>
-  </ds:schemaRefs>
-</ds:datastoreItem>
-</file>
-
-<file path=customXml/itemProps6.xml><?xml version="1.0" encoding="utf-8"?>
 <ds:datastoreItem xmlns:ds="http://schemas.openxmlformats.org/officeDocument/2006/customXml" ds:itemID="{A86F1D83-C9A8-49B5-A7A4-4B754CFBD1D9}">
   <ds:schemaRefs>
     <ds:schemaRef ds:uri="http://schemas.microsoft.com/office/2006/metadata/properties"/>
@@ -32770,6 +32866,30 @@
 </ds:datastoreItem>
 </file>
 
+<file path=customXml/itemProps4.xml><?xml version="1.0" encoding="utf-8"?>
+<ds:datastoreItem xmlns:ds="http://schemas.openxmlformats.org/officeDocument/2006/customXml" ds:itemID="{E02279C7-2801-4BF1-B032-710495FC8DAA}">
+  <ds:schemaRefs>
+    <ds:schemaRef ds:uri="urn:microsoft-dynamics-businesscentral/internal/extended/reports/Tenant_Report_Defaults/2000000001/"/>
+  </ds:schemaRefs>
+</ds:datastoreItem>
+</file>
+
+<file path=customXml/itemProps5.xml><?xml version="1.0" encoding="utf-8"?>
+<ds:datastoreItem xmlns:ds="http://schemas.openxmlformats.org/officeDocument/2006/customXml" ds:itemID="{7AEC2198-F042-4C71-9FA1-0766E4DE10D1}">
+  <ds:schemaRefs>
+    <ds:schemaRef ds:uri="http://schemas.microsoft.com/sharepoint/v3/contenttype/forms"/>
+  </ds:schemaRefs>
+</ds:datastoreItem>
+</file>
+
+<file path=customXml/itemProps6.xml><?xml version="1.0" encoding="utf-8"?>
+<ds:datastoreItem xmlns:ds="http://schemas.openxmlformats.org/officeDocument/2006/customXml" ds:itemID="{20B1C7BE-CC2E-41B2-B1D5-B0B8F36428EB}">
+  <ds:schemaRefs>
+    <ds:schemaRef ds:uri="urn:microsoft-dynamics-nav/reports/Tenant_Report_Defaults/2000000001/"/>
+  </ds:schemaRefs>
+</ds:datastoreItem>
+</file>
+
 <file path=docMetadata/LabelInfo.xml><?xml version="1.0" encoding="utf-8"?>
 <clbl:labelList xmlns:clbl="http://schemas.microsoft.com/office/2020/mipLabelMetadata">
   <clbl:label id="{f42aa342-8706-4288-bd11-ebb85995028c}" enabled="1" method="Standard" siteId="{72f988bf-86f1-41af-91ab-2d7cd011db47}" contentBits="0" removed="0"/>

</xml_diff>

<commit_message>
[29.x] Sync header/footer designs and Calm theme with main
Backport of PR #11137 (merged into main). These files had drifted
from main since the backport branch was created — main went through
further review rounds (content fixes, additional header/footer
sections) that never made it into this backport. Bring all 11
HeaderFooterDesign docx files and Calm.dotx in sync with main's
current content.
</commit_message>
<xml_diff>
--- a/src/Layers/W1/BaseApp/Foundation/Reporting/ReportParts/HeaderFooterDesign/ExternalDefaultDetailed.docx
+++ b/src/Layers/W1/BaseApp/Foundation/Reporting/ReportParts/HeaderFooterDesign/ExternalDefaultDetailed.docx
@@ -267,7 +267,7 @@
     <w:tr>
       <w:trPr>
         <w:cnfStyle w:val="100000000000" w:firstRow="1" w:lastRow="0" w:firstColumn="0" w:lastColumn="0" w:oddVBand="0" w:evenVBand="0" w:oddHBand="0" w:evenHBand="0" w:firstRowFirstColumn="0" w:firstRowLastColumn="0" w:lastRowFirstColumn="0" w:lastRowLastColumn="0"/>
-        <w:trHeight w:val="284"/>
+        <w:trHeight w:val="181"/>
       </w:trPr>
       <w:tc>
         <w:tcPr>
@@ -275,7 +275,7 @@
         </w:tcPr>
         <w:p>
           <w:pPr>
-            <w:spacing w:before="120" w:after="60"/>
+            <w:spacing w:before="120"/>
             <w:rPr>
               <w:rFonts w:cs="Segoe UI"/>
               <w:color w:val="242424"/>
@@ -317,7 +317,7 @@
         </w:tcPr>
         <w:p>
           <w:pPr>
-            <w:spacing w:before="120" w:after="60"/>
+            <w:spacing w:before="120"/>
             <w:rPr>
               <w:rFonts w:cs="Segoe UI"/>
               <w:color w:val="242424"/>
@@ -359,7 +359,7 @@
         </w:tcPr>
         <w:p>
           <w:pPr>
-            <w:spacing w:before="120" w:after="60"/>
+            <w:spacing w:before="120"/>
             <w:rPr>
               <w:rFonts w:cs="Segoe UI"/>
               <w:color w:val="242424"/>
@@ -401,7 +401,7 @@
         </w:tcPr>
         <w:p>
           <w:pPr>
-            <w:spacing w:before="120" w:after="60"/>
+            <w:spacing w:before="120"/>
             <w:rPr>
               <w:rFonts w:cs="Segoe UI"/>
               <w:color w:val="242424"/>
@@ -670,7 +670,7 @@
         <w:p>
           <w:pPr>
             <w:pStyle w:val="BCLabel"/>
-            <w:spacing w:before="120" w:after="60"/>
+            <w:spacing w:before="120"/>
             <w:rPr>
               <w:rFonts w:cstheme="majorHAnsi"/>
               <w:b/>
@@ -709,11 +709,11 @@
       </w:tc>
       <w:tc>
         <w:tcPr>
-          <w:tcW w:w="2625" w:type="dxa"/>
+          <w:tcW w:w="2624" w:type="dxa"/>
         </w:tcPr>
         <w:p>
           <w:pPr>
-            <w:spacing w:before="120" w:after="60"/>
+            <w:spacing w:before="120"/>
             <w:rPr>
               <w:rFonts w:cs="Segoe UI"/>
               <w:b/>
@@ -753,11 +753,11 @@
       </w:tc>
       <w:tc>
         <w:tcPr>
-          <w:tcW w:w="2624" w:type="dxa"/>
+          <w:tcW w:w="2623" w:type="dxa"/>
         </w:tcPr>
         <w:p>
           <w:pPr>
-            <w:spacing w:before="120" w:after="60"/>
+            <w:spacing w:before="120"/>
             <w:rPr>
               <w:rFonts w:cs="Segoe UI"/>
               <w:b/>
@@ -797,11 +797,11 @@
       </w:tc>
       <w:tc>
         <w:tcPr>
-          <w:tcW w:w="2625" w:type="dxa"/>
+          <w:tcW w:w="2624" w:type="dxa"/>
         </w:tcPr>
         <w:p>
           <w:pPr>
-            <w:spacing w:before="120" w:after="60"/>
+            <w:spacing w:before="120"/>
             <w:rPr>
               <w:rFonts w:cs="Segoe UI"/>
               <w:b/>
@@ -842,7 +842,7 @@
     </w:tr>
     <w:tr>
       <w:trPr>
-        <w:trHeight w:val="266"/>
+        <w:trHeight w:val="52"/>
       </w:trPr>
       <w:tc>
         <w:tcPr>
@@ -851,7 +851,6 @@
         <w:p>
           <w:pPr>
             <w:pStyle w:val="BCLabel"/>
-            <w:spacing w:after="120"/>
             <w:rPr>
               <w:rFonts w:cstheme="majorHAnsi"/>
               <w:b/>
@@ -902,11 +901,10 @@
       </w:tc>
       <w:tc>
         <w:tcPr>
-          <w:tcW w:w="2625" w:type="dxa"/>
+          <w:tcW w:w="2624" w:type="dxa"/>
         </w:tcPr>
         <w:p>
           <w:pPr>
-            <w:spacing w:after="120"/>
             <w:rPr>
               <w:rFonts w:cstheme="majorHAnsi"/>
               <w:b/>
@@ -943,11 +941,10 @@
       </w:tc>
       <w:tc>
         <w:tcPr>
-          <w:tcW w:w="2624" w:type="dxa"/>
+          <w:tcW w:w="2623" w:type="dxa"/>
         </w:tcPr>
         <w:p>
           <w:pPr>
-            <w:spacing w:after="120"/>
             <w:rPr>
               <w:rFonts w:cstheme="majorHAnsi"/>
               <w:b/>
@@ -998,11 +995,10 @@
       </w:tc>
       <w:tc>
         <w:tcPr>
-          <w:tcW w:w="2625" w:type="dxa"/>
+          <w:tcW w:w="2624" w:type="dxa"/>
         </w:tcPr>
         <w:p>
           <w:pPr>
-            <w:spacing w:after="120"/>
             <w:rPr>
               <w:rFonts w:cstheme="majorHAnsi"/>
               <w:b/>
@@ -1035,6 +1031,28 @@
               </w:r>
             </w:sdtContent>
           </w:sdt>
+        </w:p>
+      </w:tc>
+    </w:tr>
+    <w:tr>
+      <w:trPr>
+        <w:trHeight w:val="52"/>
+      </w:trPr>
+      <w:tc>
+        <w:tcPr>
+          <w:tcW w:w="10495" w:type="dxa"/>
+          <w:gridSpan w:val="4"/>
+        </w:tcPr>
+        <w:p>
+          <w:pPr>
+            <w:spacing w:line="240" w:lineRule="auto"/>
+            <w:rPr>
+              <w:rFonts w:cs="Segoe UI"/>
+              <w:color w:val="242424"/>
+              <w:sz w:val="8"/>
+              <w:szCs w:val="8"/>
+            </w:rPr>
+          </w:pPr>
         </w:p>
       </w:tc>
     </w:tr>
@@ -1080,7 +1098,7 @@
       </w:tc>
       <w:tc>
         <w:tcPr>
-          <w:tcW w:w="2625" w:type="dxa"/>
+          <w:tcW w:w="2624" w:type="dxa"/>
         </w:tcPr>
         <w:p>
           <w:pPr>
@@ -1119,7 +1137,7 @@
       </w:tc>
       <w:tc>
         <w:tcPr>
-          <w:tcW w:w="2624" w:type="dxa"/>
+          <w:tcW w:w="2623" w:type="dxa"/>
         </w:tcPr>
         <w:p>
           <w:pPr>
@@ -1158,7 +1176,7 @@
       </w:tc>
       <w:tc>
         <w:tcPr>
-          <w:tcW w:w="2625" w:type="dxa"/>
+          <w:tcW w:w="2624" w:type="dxa"/>
         </w:tcPr>
         <w:p>
           <w:pPr>
@@ -1247,7 +1265,7 @@
       </w:tc>
       <w:tc>
         <w:tcPr>
-          <w:tcW w:w="2625" w:type="dxa"/>
+          <w:tcW w:w="2624" w:type="dxa"/>
         </w:tcPr>
         <w:p>
           <w:pPr>
@@ -1286,7 +1304,7 @@
       </w:tc>
       <w:tc>
         <w:tcPr>
-          <w:tcW w:w="2624" w:type="dxa"/>
+          <w:tcW w:w="2623" w:type="dxa"/>
         </w:tcPr>
         <w:p>
           <w:pPr>
@@ -1325,7 +1343,7 @@
       </w:tc>
       <w:tc>
         <w:tcPr>
-          <w:tcW w:w="2625" w:type="dxa"/>
+          <w:tcW w:w="2624" w:type="dxa"/>
         </w:tcPr>
         <w:p>
           <w:pPr>
@@ -1434,7 +1452,7 @@
             <w:tag w:val="#BC:InsertDataItem,BCReportInformation/ReportMetadata/ReportCaption"/>
             <w:id w:val="-1105262526"/>
             <w:placeholder>
-              <w:docPart w:val="9351E1828E2647B397589986DFAEE98B"/>
+              <w:docPart w:val="A470FFC2275947AF90A0CCF60903D2DE"/>
             </w:placeholder>
             <w:dataBinding w:prefixMappings="&lt;xmlns:ns0='urn:microsoft-dynamics-nav/reports/Tenant_Report_Defaults/2000000001/' " w:xpath="/ns0:NavWordReportXmlPart[1]/ns0:BCReportInformation[1]/ns0:ReportMetadata[1]/ns0:ReportCaption[1]" w:storeItemID="{00000000-0000-0000-0000-000000000000}"/>
             <w15:color w:val="808080"/>
@@ -1444,6 +1462,7 @@
             <w:p>
               <w:pPr>
                 <w:pStyle w:val="Title"/>
+                <w:spacing w:before="0" w:after="0"/>
                 <w:rPr>
                   <w:rFonts w:ascii="Segoe UI" w:eastAsia="Times New Roman" w:hAnsi="Segoe UI" w:cs="Segoe UI"/>
                   <w:sz w:val="56"/>
@@ -1478,7 +1497,8 @@
             <w:p>
               <w:pPr>
                 <w:pStyle w:val="BCNumber"/>
-                <w:spacing w:after="360"/>
+                <w:spacing w:before="60"/>
+                <w:jc w:val="right"/>
               </w:pPr>
               <w:r>
                 <w:fldChar w:fldCharType="begin"/>
@@ -1551,13 +1571,55 @@
             <w:pStyle w:val="NoSpacing"/>
             <w:jc w:val="right"/>
           </w:pPr>
+          <w:r>
+            <w:t>Friday</w:t>
+          </w:r>
+          <w:r>
+            <w:t>,</w:t>
+          </w:r>
+          <w:r>
+            <w:t xml:space="preserve"> September </w:t>
+          </w:r>
+          <w:r>
+            <w:t>23, 2026</w:t>
+          </w:r>
+        </w:p>
+      </w:tc>
+    </w:tr>
+    <w:tr>
+      <w:trPr>
+        <w:trHeight w:val="80"/>
+      </w:trPr>
+      <w:tc>
+        <w:tcPr>
+          <w:tcW w:w="3302" w:type="pct"/>
+          <w:vMerge/>
+        </w:tcPr>
+        <w:p>
+          <w:pPr>
+            <w:spacing w:before="120"/>
+            <w:rPr>
+              <w:rFonts w:ascii="Aptos" w:eastAsia="Aptos" w:hAnsi="Aptos" w:cs="Times New Roman"/>
+            </w:rPr>
+          </w:pPr>
+        </w:p>
+      </w:tc>
+      <w:tc>
+        <w:tcPr>
+          <w:tcW w:w="1698" w:type="pct"/>
+        </w:tcPr>
+        <w:p>
+          <w:pPr>
+            <w:pStyle w:val="NoSpacing"/>
+            <w:jc w:val="right"/>
+          </w:pPr>
           <w:sdt>
             <w:sdtPr>
               <w:alias w:val="CompanyName"/>
               <w:tag w:val="#BC:InsertDataItem,BCReportInformation/ReportRequest/CompanyName"/>
-              <w:id w:val="975574590"/>
+              <w:id w:val="1327564643"/>
               <w:placeholder>
-                <w:docPart w:val="EFC9E7A090A04250AD62E99527EC3400"/>
+                <w:docPart w:val="AD8251DE783341B48D89D00C46DFB6CF"/>
               </w:placeholder>
               <w:dataBinding w:prefixMappings="&lt;xmlns:ns0='urn:microsoft-dynamics-nav/reports/Tenant_Report_Defaults/2000000001/' " w:xpath="/ns0:NavWordReportXmlPart[1]/ns0:BCReportInformation[1]/ns0:ReportRequest[1]/ns0:CompanyName[1]" w:storeItemID="{00000000-0000-0000-0000-000000000000}"/>
               <w15:color w:val="808080"/>
@@ -1632,7 +1694,6 @@
                   <w:tab w:val="center" w:pos="5310"/>
                   <w:tab w:val="right" w:pos="10440"/>
                 </w:tabs>
-                <w:ind w:right="26"/>
                 <w:rPr>
                   <w:color w:val="242424"/>
                   <w:sz w:val="36"/>
@@ -1670,7 +1731,7 @@
           <w:sdtContent>
             <w:p>
               <w:pPr>
-                <w:spacing w:after="120"/>
+                <w:spacing w:before="60"/>
                 <w:jc w:val="right"/>
                 <w:rPr>
                   <w:color w:val="242424"/>
@@ -3263,7 +3324,6 @@
     <w:uiPriority w:val="1"/>
     <w:semiHidden/>
     <w:unhideWhenUsed/>
-    <w:rsid w:val="008C78C0"/>
   </w:style>
   <w:style w:type="table" w:default="1" w:styleId="TableNormal">
     <w:name w:val="Normal Table"/>
@@ -3285,7 +3345,6 @@
     <w:uiPriority w:val="99"/>
     <w:semiHidden/>
     <w:unhideWhenUsed/>
-    <w:rsid w:val="008C78C0"/>
   </w:style>
   <w:style w:type="table" w:styleId="TableGrid">
     <w:name w:val="Table Grid"/>
@@ -30111,35 +30170,6 @@
         <w:p>
           <w:pPr>
             <w:pStyle w:val="568E8CB4D7A94ED2BC0C28819883F940"/>
-          </w:pPr>
-          <w:r>
-            <w:rPr>
-              <w:rStyle w:val="PlaceholderText"/>
-            </w:rPr>
-            <w:t>Click or tap here to enter text.</w:t>
-          </w:r>
-        </w:p>
-      </w:docPartBody>
-    </w:docPart>
-    <w:docPart>
-      <w:docPartPr>
-        <w:name w:val="9351E1828E2647B397589986DFAEE98B"/>
-        <w:category>
-          <w:name w:val="Generelt"/>
-          <w:gallery w:val="placeholder"/>
-        </w:category>
-        <w:types>
-          <w:type w:val="bbPlcHdr"/>
-        </w:types>
-        <w:behaviors>
-          <w:behavior w:val="content"/>
-        </w:behaviors>
-        <w:guid w:val="{F1578845-B221-4ED7-9F25-9C419199421F}"/>
-      </w:docPartPr>
-      <w:docPartBody>
-        <w:p>
-          <w:pPr>
-            <w:pStyle w:val="9351E1828E2647B397589986DFAEE98B"/>
           </w:pPr>
           <w:r>
             <w:rPr>
@@ -30604,35 +30634,6 @@
     </w:docPart>
     <w:docPart>
       <w:docPartPr>
-        <w:name w:val="EFC9E7A090A04250AD62E99527EC3400"/>
-        <w:category>
-          <w:name w:val="General"/>
-          <w:gallery w:val="placeholder"/>
-        </w:category>
-        <w:types>
-          <w:type w:val="bbPlcHdr"/>
-        </w:types>
-        <w:behaviors>
-          <w:behavior w:val="content"/>
-        </w:behaviors>
-        <w:guid w:val="{41EA72BB-A937-4ADC-9CA6-D8F319D72E92}"/>
-      </w:docPartPr>
-      <w:docPartBody>
-        <w:p>
-          <w:pPr>
-            <w:pStyle w:val="EFC9E7A090A04250AD62E99527EC3400"/>
-          </w:pPr>
-          <w:r>
-            <w:rPr>
-              <w:rStyle w:val="PlaceholderText"/>
-            </w:rPr>
-            <w:t>Click or tap here to enter text.</w:t>
-          </w:r>
-        </w:p>
-      </w:docPartBody>
-    </w:docPart>
-    <w:docPart>
-      <w:docPartPr>
         <w:name w:val="85701054D69D41C2BD908C9148E6F4EB"/>
         <w:category>
           <w:name w:val="General"/>
@@ -30863,6 +30864,64 @@
         </w:p>
       </w:docPartBody>
     </w:docPart>
+    <w:docPart>
+      <w:docPartPr>
+        <w:name w:val="A470FFC2275947AF90A0CCF60903D2DE"/>
+        <w:category>
+          <w:name w:val="General"/>
+          <w:gallery w:val="placeholder"/>
+        </w:category>
+        <w:types>
+          <w:type w:val="bbPlcHdr"/>
+        </w:types>
+        <w:behaviors>
+          <w:behavior w:val="content"/>
+        </w:behaviors>
+        <w:guid w:val="{691ECADA-FE98-48FD-ADAB-644415B52353}"/>
+      </w:docPartPr>
+      <w:docPartBody>
+        <w:p>
+          <w:pPr>
+            <w:pStyle w:val="A470FFC2275947AF90A0CCF60903D2DE"/>
+          </w:pPr>
+          <w:r>
+            <w:rPr>
+              <w:rStyle w:val="PlaceholderText"/>
+            </w:rPr>
+            <w:t>Click or tap here to enter text.</w:t>
+          </w:r>
+        </w:p>
+      </w:docPartBody>
+    </w:docPart>
+    <w:docPart>
+      <w:docPartPr>
+        <w:name w:val="AD8251DE783341B48D89D00C46DFB6CF"/>
+        <w:category>
+          <w:name w:val="General"/>
+          <w:gallery w:val="placeholder"/>
+        </w:category>
+        <w:types>
+          <w:type w:val="bbPlcHdr"/>
+        </w:types>
+        <w:behaviors>
+          <w:behavior w:val="content"/>
+        </w:behaviors>
+        <w:guid w:val="{9F453786-3631-4712-A661-F064FC2A4655}"/>
+      </w:docPartPr>
+      <w:docPartBody>
+        <w:p>
+          <w:pPr>
+            <w:pStyle w:val="AD8251DE783341B48D89D00C46DFB6CF"/>
+          </w:pPr>
+          <w:r>
+            <w:rPr>
+              <w:rStyle w:val="PlaceholderText"/>
+            </w:rPr>
+            <w:t>Click or tap here to enter text.</w:t>
+          </w:r>
+        </w:p>
+      </w:docPartBody>
+    </w:docPart>
   </w:docParts>
 </w:glossaryDocument>
 </file>
@@ -30919,12 +30978,14 @@
     <w:sig w:usb0="E4002EFF" w:usb1="C000E47F" w:usb2="00000009" w:usb3="00000000" w:csb0="000001FF" w:csb1="00000000"/>
   </w:font>
   <w:font w:name="Aptos">
+    <w:panose1 w:val="020B0004020202020204"/>
     <w:charset w:val="00"/>
     <w:family w:val="swiss"/>
     <w:pitch w:val="variable"/>
     <w:sig w:usb0="20000287" w:usb1="00000003" w:usb2="00000000" w:usb3="00000000" w:csb0="0000019F" w:csb1="00000000"/>
   </w:font>
   <w:font w:name="Aptos Display">
+    <w:panose1 w:val="020B0004020202020204"/>
     <w:charset w:val="00"/>
     <w:family w:val="swiss"/>
     <w:pitch w:val="variable"/>
@@ -30957,6 +31018,7 @@
     <w:rsid w:val="0009355D"/>
     <w:rsid w:val="001024DE"/>
     <w:rsid w:val="001024F7"/>
+    <w:rsid w:val="00107F6B"/>
     <w:rsid w:val="00133336"/>
     <w:rsid w:val="00184BAF"/>
     <w:rsid w:val="001A2258"/>
@@ -31007,6 +31069,7 @@
     <w:rsid w:val="0080614B"/>
     <w:rsid w:val="00822ACB"/>
     <w:rsid w:val="00825186"/>
+    <w:rsid w:val="0087642A"/>
     <w:rsid w:val="0089757A"/>
     <w:rsid w:val="008A720C"/>
     <w:rsid w:val="008C225B"/>
@@ -31033,6 +31096,7 @@
     <w:rsid w:val="00BF27CE"/>
     <w:rsid w:val="00C03606"/>
     <w:rsid w:val="00C224B4"/>
+    <w:rsid w:val="00C32F6B"/>
     <w:rsid w:val="00CB7A61"/>
     <w:rsid w:val="00CB7A74"/>
     <w:rsid w:val="00CC7327"/>
@@ -31504,7 +31568,7 @@
     <w:basedOn w:val="DefaultParagraphFont"/>
     <w:uiPriority w:val="99"/>
     <w:semiHidden/>
-    <w:rsid w:val="0055153E"/>
+    <w:rsid w:val="00C32F6B"/>
     <w:rPr>
       <w:color w:val="808080"/>
     </w:rPr>
@@ -31817,6 +31881,62 @@
       <w:kern w:val="2"/>
       <w:sz w:val="24"/>
       <w:szCs w:val="24"/>
+      <w14:ligatures w14:val="standardContextual"/>
+    </w:rPr>
+  </w:style>
+  <w:style w:type="paragraph" w:customStyle="1" w:styleId="DA23F7B6FEFE4123804DF6120FC699C1">
+    <w:name w:val="DA23F7B6FEFE4123804DF6120FC699C1"/>
+    <w:rsid w:val="00C32F6B"/>
+    <w:pPr>
+      <w:spacing w:line="278" w:lineRule="auto"/>
+    </w:pPr>
+    <w:rPr>
+      <w:kern w:val="2"/>
+      <w:sz w:val="24"/>
+      <w:szCs w:val="24"/>
+      <w:lang w:val="en-DK" w:eastAsia="en-DK"/>
+      <w14:ligatures w14:val="standardContextual"/>
+    </w:rPr>
+  </w:style>
+  <w:style w:type="paragraph" w:customStyle="1" w:styleId="A470FFC2275947AF90A0CCF60903D2DE">
+    <w:name w:val="A470FFC2275947AF90A0CCF60903D2DE"/>
+    <w:rsid w:val="00C32F6B"/>
+    <w:pPr>
+      <w:spacing w:line="278" w:lineRule="auto"/>
+    </w:pPr>
+    <w:rPr>
+      <w:kern w:val="2"/>
+      <w:sz w:val="24"/>
+      <w:szCs w:val="24"/>
+      <w:lang w:val="en-DK" w:eastAsia="en-DK"/>
+      <w14:ligatures w14:val="standardContextual"/>
+    </w:rPr>
+  </w:style>
+  <w:style w:type="paragraph" w:customStyle="1" w:styleId="692B9BB1C04C471EB89905D584C97CF4">
+    <w:name w:val="692B9BB1C04C471EB89905D584C97CF4"/>
+    <w:rsid w:val="00C32F6B"/>
+    <w:pPr>
+      <w:spacing w:line="278" w:lineRule="auto"/>
+    </w:pPr>
+    <w:rPr>
+      <w:kern w:val="2"/>
+      <w:sz w:val="24"/>
+      <w:szCs w:val="24"/>
+      <w:lang w:val="en-DK" w:eastAsia="en-DK"/>
+      <w14:ligatures w14:val="standardContextual"/>
+    </w:rPr>
+  </w:style>
+  <w:style w:type="paragraph" w:customStyle="1" w:styleId="AD8251DE783341B48D89D00C46DFB6CF">
+    <w:name w:val="AD8251DE783341B48D89D00C46DFB6CF"/>
+    <w:rsid w:val="00C32F6B"/>
+    <w:pPr>
+      <w:spacing w:line="278" w:lineRule="auto"/>
+    </w:pPr>
+    <w:rPr>
+      <w:kern w:val="2"/>
+      <w:sz w:val="24"/>
+      <w:szCs w:val="24"/>
+      <w:lang w:val="en-DK" w:eastAsia="en-DK"/>
       <w14:ligatures w14:val="standardContextual"/>
     </w:rPr>
   </w:style>
@@ -32093,7 +32213,7 @@
 
 <file path=word/webextensions/taskpanes.xml><?xml version="1.0" encoding="utf-8"?>
 <wetp:taskpanes xmlns:wetp="http://schemas.microsoft.com/office/webextensions/taskpanes/2010/11">
-  <wetp:taskpane dockstate="right" visibility="0" width="350" row="7">
+  <wetp:taskpane dockstate="right" visibility="0" width="350" row="8">
     <wetp:webextensionref xmlns:r="http://schemas.openxmlformats.org/officeDocument/2006/relationships" r:id="rId1"/>
   </wetp:taskpane>
 </wetp:taskpanes>
@@ -32112,6 +32232,10 @@
 </file>
 
 <file path=customXml/item1.xml><?xml version="1.0" encoding="utf-8"?>
+<b:Sources xmlns:b="http://schemas.openxmlformats.org/officeDocument/2006/bibliography" xmlns="http://schemas.openxmlformats.org/officeDocument/2006/bibliography" SelectedStyle="\APASixthEditionOfficeOnline.xsl" StyleName="APA" Version="6"/>
+</file>
+
+<file path=customXml/item2.xml><?xml version="1.0" encoding="utf-8"?>
 <ct:contentTypeSchema xmlns:ct="http://schemas.microsoft.com/office/2006/metadata/contentType" xmlns:ma="http://schemas.microsoft.com/office/2006/metadata/properties/metaAttributes" ct:_="" ma:_="" ma:contentTypeName="Document" ma:contentTypeID="0x0101001DCAE6B6EBFA5442B0B9E84E60AFF245" ma:contentTypeVersion="18" ma:contentTypeDescription="Create a new document." ma:contentTypeScope="" ma:versionID="69eec3b24558e1297a79cd42e69b0397">
   <xsd:schema xmlns:xsd="http://www.w3.org/2001/XMLSchema" xmlns:xs="http://www.w3.org/2001/XMLSchema" xmlns:p="http://schemas.microsoft.com/office/2006/metadata/properties" xmlns:ns1="http://schemas.microsoft.com/sharepoint/v3" xmlns:ns2="178f68d8-b893-4efd-8406-fab0f21873e4" xmlns:ns3="b83e059f-de16-406c-a902-3d56d4e79ec8" targetNamespace="http://schemas.microsoft.com/office/2006/metadata/properties" ma:root="true" ma:fieldsID="0f52a3acd42ec0bd0d267ba89c916a39" ns1:_="" ns2:_="" ns3:_="">
     <xsd:import namespace="http://schemas.microsoft.com/sharepoint/v3"/>
@@ -32377,169 +32501,23 @@
 </ct:contentTypeSchema>
 </file>
 
-<file path=customXml/item2.xml><?xml version="1.0" encoding="utf-8"?>
-<b:Sources xmlns:b="http://schemas.openxmlformats.org/officeDocument/2006/bibliography" xmlns="http://schemas.openxmlformats.org/officeDocument/2006/bibliography" SelectedStyle="\APASixthEditionOfficeOnline.xsl" StyleName="APA" Version="6"/>
+<file path=customXml/item3.xml><?xml version="1.0" encoding="utf-8"?>
+<p:properties xmlns:p="http://schemas.microsoft.com/office/2006/metadata/properties" xmlns:xsi="http://www.w3.org/2001/XMLSchema-instance" xmlns:pc="http://schemas.microsoft.com/office/infopath/2007/PartnerControls">
+  <documentManagement>
+    <Package xmlns="178f68d8-b893-4efd-8406-fab0f21873e4" xsi:nil="true"/>
+    <lcf76f155ced4ddcb4097134ff3c332f xmlns="178f68d8-b893-4efd-8406-fab0f21873e4">
+      <Terms xmlns="http://schemas.microsoft.com/office/infopath/2007/PartnerControls"/>
+    </lcf76f155ced4ddcb4097134ff3c332f>
+    <_ip_UnifiedCompliancePolicyUIAction xmlns="http://schemas.microsoft.com/sharepoint/v3" xsi:nil="true"/>
+    <TaxCatchAll xmlns="b83e059f-de16-406c-a902-3d56d4e79ec8" xsi:nil="true"/>
+    <Audience xmlns="178f68d8-b893-4efd-8406-fab0f21873e4" xsi:nil="true"/>
+    <_ip_UnifiedCompliancePolicyProperties xmlns="http://schemas.microsoft.com/sharepoint/v3" xsi:nil="true"/>
+    <DocumentType xmlns="178f68d8-b893-4efd-8406-fab0f21873e4" xsi:nil="true"/>
+  </documentManagement>
+</p:properties>
 </file>
 
-<file path=customXml/item3.xml>��< ? x m l   v e r s i o n = " 1 . 0 "   e n c o d i n g = " u t f - 1 6 " ? > < N a v W o r d R e p o r t X m l P a r t   x m l n s = " u r n : m i c r o s o f t - d y n a m i c s - n a v / r e p o r t s / T e n a n t _ R e p o r t _ D e f a u l t s / 2 0 0 0 0 0 0 0 0 1 / " > - 
-     < B C R e p o r t I n f o r m a t i o n > - 
-         < R e p o r t M e t a d a t a > - 
-             < E x t e n s i o n I d > E x t e n s i o n   I D < / E x t e n s i o n I d > - 
-             < E x t e n s i o n N a m e > E x t e n s i o n   N a m e < / E x t e n s i o n N a m e > - 
-             < E x t e n s i o n P u b l i s h e r > E x t e n s i o n   P u b l i s h e r < / E x t e n s i o n P u b l i s h e r > - 
-             < E x t e n s i o n V e r s i o n > E x t e n s i o n   V e r s i o n < / E x t e n s i o n V e r s i o n > - 
-             < R e p o r t I d > R e p o r t   I D < / R e p o r t I d > - 
-             < R e p o r t N a m e > R e p o r t   N a m e < / R e p o r t N a m e > - 
-             < R e p o r t C a p t i o n > R e p o r t   C a p t i o n < / R e p o r t C a p t i o n > - 
-             < A b o u t T h i s R e p o r t T i t l e > A b o u t   T h i s   R e p o r t   T i t l e < / A b o u t T h i s R e p o r t T i t l e > - 
-             < A b o u t T h i s R e p o r t T e x t > A b o u t   T h i s   R e p o r t   T e x t < / A b o u t T h i s R e p o r t T e x t > - 
-             < R e p o r t H e l p L i n k > R e p o r t   H e l p   L i n k < / R e p o r t H e l p L i n k > - 
-         < / R e p o r t M e t a d a t a > - 
-         < R e p o r t R e q u e s t > - 
-             < T e n a n t E n t r a I d > T e n a n t   E n t r a   I d < / T e n a n t E n t r a I d > - 
-             < E n v i r o n m e n t N a m e > E n v i r o n m e n t   N a m e < / E n v i r o n m e n t N a m e > - 
-             < E n v i r o n m e n t T y p e > E n v i r o n m e n t   T y p e < / E n v i r o n m e n t T y p e > - 
-             < C o m p a n y N a m e > C o m p a n y   N a m e < / C o m p a n y N a m e > - 
-             < C o m p a n y D i s p l a y N a m e > C o m p a n y   D i s p l a y   N a m e < / C o m p a n y D i s p l a y N a m e > - 
-             < C o m p a n y I d > C o m p a n y   I D < / C o m p a n y I d > - 
-             < U s e r N a m e > U s e r   N a m e < / U s e r N a m e > - 
-             < D a t e A n d T i m e > D a t e   a n d   T i m e < / D a t e A n d T i m e > - 
-             < L a n g u a g e > L a n g u a g e < / L a n g u a g e > - 
-             < F o r m a t R e g i o n > F o r m a t   R e g i o n < / F o r m a t R e g i o n > - 
-             < D a t e T i m e V a l u e s > - 
-                 < Y e a r > Y e a r < / Y e a r > - 
-                 < M o n t h N u m b e r > M o n t h   N u m b e r < / M o n t h N u m b e r > - 
-                 < D a y N u m b e r > D a y   N u m b e r < / D a y N u m b e r > - 
-                 < H o u r > H o u r < / H o u r > - 
-                 < M i n u t e > M i n u t e < / M i n u t e > - 
-             < / D a t e T i m e V a l u e s > - 
-         < / R e p o r t R e q u e s t > - 
-         < C o m p a n y M e t a d a t a > - 
-             < C o m p a n y N a m e > C o m p a n y   N a m e < / C o m p a n y N a m e > - 
-             < C o m p a n y D i s p l a y N a m e > C o m p a n y   D i s p l a y   N a m e < / C o m p a n y D i s p l a y N a m e > - 
-             < C o m p a n y A d d r e s s L i n e s > - 
-                 < C o m p a n y A d d r e s s L i n e 1 > C o m p a n y   A d d r e s s   L i n e   1 < / C o m p a n y A d d r e s s L i n e 1 > - 
-                 < C o m p a n y A d d r e s s L i n e 2 > C o m p a n y   A d d r e s s   L i n e   2 < / C o m p a n y A d d r e s s L i n e 2 > - 
-                 < C o m p a n y A d d r e s s L i n e 3 > C o m p a n y   A d d r e s s   L i n e   3 < / C o m p a n y A d d r e s s L i n e 3 > - 
-                 < C o m p a n y A d d r e s s L i n e 4 > C o m p a n y   A d d r e s s   L i n e   4 < / C o m p a n y A d d r e s s L i n e 4 > - 
-                 < C o m p a n y A d d r e s s L i n e 5 > C o m p a n y   A d d r e s s   L i n e   5 < / C o m p a n y A d d r e s s L i n e 5 > - 
-                 < C o m p a n y A d d r e s s L i n e 6 > C o m p a n y   A d d r e s s   L i n e   6 < / C o m p a n y A d d r e s s L i n e 6 > - 
-                 < C o m p a n y A d d r e s s L i n e 7 > C o m p a n y   A d d r e s s   L i n e   7 < / C o m p a n y A d d r e s s L i n e 7 > - 
-                 < C o m p a n y A d d r e s s L i n e 8 > C o m p a n y   A d d r e s s   L i n e   8 < / C o m p a n y A d d r e s s L i n e 8 > - 
-             < / C o m p a n y A d d r e s s L i n e s > - 
-             < C o m p a n y P h o n e > C o m p a n y   P h o n e < / C o m p a n y P h o n e > - 
-             < C o m p a n y P h o n e C a p t i o n > C o m p a n y   P h o n e   C a p t i o n < / C o m p a n y P h o n e C a p t i o n > - 
-             < C o m p a n y F a x N o > C o m p a n y   F a x   N o . < / C o m p a n y F a x N o > - 
-             < C o m p a n y F a x N o C a p t i o n > C o m p a n y   F a x   N o .   C a p t i o n < / C o m p a n y F a x N o C a p t i o n > - 
-             < C o m p a n y E m a i l > C o m p a n y   E m a i l < / C o m p a n y E m a i l > - 
-             < C o m p a n y E m a i l C a p t i o n > C o m p a n y   E m a i l   C a p t i o n < / C o m p a n y E m a i l C a p t i o n > - 
-             < C o m p a n y H o m e P a g e > C o m p a n y   H o m e   P a g e < / C o m p a n y H o m e P a g e > - 
-             < C o m p a n y H o m e P a g e C a p t i o n > C o m p a n y   H o m e   P a g e   C a p t i o n < / C o m p a n y H o m e P a g e C a p t i o n > - 
-             < C o m p a n y L o g o > C o m p a n y   L o g o < / C o m p a n y L o g o > - 
-             < C o m p a n y V A T R e g i s t r a t i o n N o > C o m p a n y   V A T   R e g i s t r a t i o n   N o . < / C o m p a n y V A T R e g i s t r a t i o n N o > - 
-             < C o m p a n y V A T R e g i s t r a t i o n N o C a p t i o n > C o m p a n y   V A T   R e g i s t r a t i o n   N o .   C a p t i o n < / C o m p a n y V A T R e g i s t r a t i o n N o C a p t i o n > - 
-             < C o m p a n y R e g i s t r a t i o n N o > C o m p a n y   R e g i s t r a t i o n   N o . < / C o m p a n y R e g i s t r a t i o n N o > - 
-             < C o m p a n y R e g i s t r a t i o n N o C a p t i o n > C o m p a n y   R e g i s t r a t i o n   N o .   C a p t i o n < / C o m p a n y R e g i s t r a t i o n N o C a p t i o n > - 
-             < C o m p a n y B a n k N a m e > C o m p a n y   B a n k   N a m e < / C o m p a n y B a n k N a m e > - 
-             < C o m p a n y B a n k N a m e C a p t i o n > C o m p a n y   B a n k   N a m e   C a p t i o n < / C o m p a n y B a n k N a m e C a p t i o n > - 
-             < C o m p a n y B a n k A c c o u n t N o > C o m p a n y   B a n k   A c c o u n t   N o . < / C o m p a n y B a n k A c c o u n t N o > - 
-             < C o m p a n y B a n k A c c o u n t N o C a p t i o n > C o m p a n y   B a n k   A c c o u n t   N o .   C a p t i o n < / C o m p a n y B a n k A c c o u n t N o C a p t i o n > - 
-             < C o m p a n y B a n k B r a n c h N o > C o m p a n y   B a n k   B r a n c h   N o . < / C o m p a n y B a n k B r a n c h N o > - 
-             < C o m p a n y B a n k B r a n c h N o C a p t i o n > C o m p a n y   B a n k   B r a n c h   N o .   C a p t i o n < / C o m p a n y B a n k B r a n c h N o C a p t i o n > - 
-             < C o m p a n y I B A N > C o m p a n y   I B A N < / C o m p a n y I B A N > - 
-             < C o m p a n y I B A N C a p t i o n > C o m p a n y   I B A N   C a p t i o n < / C o m p a n y I B A N C a p t i o n > - 
-             < C o m p a n y B a n k S W I F T > C o m p a n y   B a n k   S W I F T < / C o m p a n y B a n k S W I F T > - 
-             < C o m p a n y B a n k S W I F T C a p t i o n > C o m p a n y   B a n k   S W I F T   C a p t i o n < / C o m p a n y B a n k S W I F T C a p t i o n > - 
-             < C o m p a n y G i r o N o > C o m p a n y   G i r o   N o . < / C o m p a n y G i r o N o > - 
-             < C o m p a n y G i r o N o C a p t i o n > C o m p a n y   G i r o   N o .   C a p t i o n < / C o m p a n y G i r o N o C a p t i o n > - 
-         < / C o m p a n y M e t a d a t a > - 
-     < / B C R e p o r t I n f o r m a t i o n > - 
- < / N a v W o r d R e p o r t X m l P a r t > 
-</file>
-
-<file path=customXml/item4.xml><?xml version="1.0" encoding="utf-8"?>
-<?mso-contentType ?>
-<FormTemplates xmlns="http://schemas.microsoft.com/sharepoint/v3/contenttype/forms">
-  <Display>DocumentLibraryForm</Display>
-  <Edit>DocumentLibraryForm</Edit>
-  <New>DocumentLibraryForm</New>
-</FormTemplates>
-</file>
-
-<file path=customXml/item5.xml>��< ? x m l   v e r s i o n = " 1 . 0 "   e n c o d i n g = " u t f - 1 6 " ? > < N a v W o r d R e p o r t X m l P a r t   x m l n s = " u r n : m i c r o s o f t - d y n a m i c s - b u s i n e s s c e n t r a l / i n t e r n a l / e x t e n d e d / r e p o r t s / T e n a n t _ R e p o r t _ D e f a u l t s / 2 0 0 0 0 0 0 0 0 1 / " > +<file path=customXml/item4.xml>��< ? x m l   v e r s i o n = " 1 . 0 "   e n c o d i n g = " u t f - 1 6 " ? > < N a v W o r d R e p o r t X m l P a r t   x m l n s = " u r n : m i c r o s o f t - d y n a m i c s - b u s i n e s s c e n t r a l / i n t e r n a l / e x t e n d e d / r e p o r t s / T e n a n t _ R e p o r t _ D e f a u l t s / 2 0 0 0 0 0 0 0 0 1 / " >   
      < B C R e p o r t I n f o r m a t i o n >   
@@ -32690,23 +32668,173 @@
  < / N a v W o r d R e p o r t X m l P a r t > 
 </file>
 
-<file path=customXml/item6.xml><?xml version="1.0" encoding="utf-8"?>
-<p:properties xmlns:p="http://schemas.microsoft.com/office/2006/metadata/properties" xmlns:xsi="http://www.w3.org/2001/XMLSchema-instance" xmlns:pc="http://schemas.microsoft.com/office/infopath/2007/PartnerControls">
-  <documentManagement>
-    <Package xmlns="178f68d8-b893-4efd-8406-fab0f21873e4" xsi:nil="true"/>
-    <lcf76f155ced4ddcb4097134ff3c332f xmlns="178f68d8-b893-4efd-8406-fab0f21873e4">
-      <Terms xmlns="http://schemas.microsoft.com/office/infopath/2007/PartnerControls"/>
-    </lcf76f155ced4ddcb4097134ff3c332f>
-    <_ip_UnifiedCompliancePolicyUIAction xmlns="http://schemas.microsoft.com/sharepoint/v3" xsi:nil="true"/>
-    <TaxCatchAll xmlns="b83e059f-de16-406c-a902-3d56d4e79ec8" xsi:nil="true"/>
-    <Audience xmlns="178f68d8-b893-4efd-8406-fab0f21873e4" xsi:nil="true"/>
-    <_ip_UnifiedCompliancePolicyProperties xmlns="http://schemas.microsoft.com/sharepoint/v3" xsi:nil="true"/>
-    <DocumentType xmlns="178f68d8-b893-4efd-8406-fab0f21873e4" xsi:nil="true"/>
-  </documentManagement>
-</p:properties>
+<file path=customXml/item5.xml><?xml version="1.0" encoding="utf-8"?>
+<?mso-contentType ?>
+<FormTemplates xmlns="http://schemas.microsoft.com/sharepoint/v3/contenttype/forms">
+  <Display>DocumentLibraryForm</Display>
+  <Edit>DocumentLibraryForm</Edit>
+  <New>DocumentLibraryForm</New>
+</FormTemplates>
+</file>
+
+<file path=customXml/item6.xml>��< ? x m l   v e r s i o n = " 1 . 0 "   e n c o d i n g = " u t f - 1 6 " ? > < N a v W o r d R e p o r t X m l P a r t   x m l n s = " u r n : m i c r o s o f t - d y n a m i c s - n a v / r e p o r t s / T e n a n t _ R e p o r t _ D e f a u l t s / 2 0 0 0 0 0 0 0 0 1 / " > + 
+     < B C R e p o r t I n f o r m a t i o n > + 
+         < R e p o r t M e t a d a t a > + 
+             < E x t e n s i o n I d > E x t e n s i o n   I D < / E x t e n s i o n I d > + 
+             < E x t e n s i o n N a m e > E x t e n s i o n   N a m e < / E x t e n s i o n N a m e > + 
+             < E x t e n s i o n P u b l i s h e r > E x t e n s i o n   P u b l i s h e r < / E x t e n s i o n P u b l i s h e r > + 
+             < E x t e n s i o n V e r s i o n > E x t e n s i o n   V e r s i o n < / E x t e n s i o n V e r s i o n > + 
+             < R e p o r t I d > R e p o r t   I D < / R e p o r t I d > + 
+             < R e p o r t N a m e > R e p o r t   N a m e < / R e p o r t N a m e > + 
+             < R e p o r t C a p t i o n > R e p o r t   C a p t i o n < / R e p o r t C a p t i o n > + 
+             < A b o u t T h i s R e p o r t T i t l e > A b o u t   T h i s   R e p o r t   T i t l e < / A b o u t T h i s R e p o r t T i t l e > + 
+             < A b o u t T h i s R e p o r t T e x t > A b o u t   T h i s   R e p o r t   T e x t < / A b o u t T h i s R e p o r t T e x t > + 
+             < R e p o r t H e l p L i n k > R e p o r t   H e l p   L i n k < / R e p o r t H e l p L i n k > + 
+         < / R e p o r t M e t a d a t a > + 
+         < R e p o r t R e q u e s t > + 
+             < T e n a n t E n t r a I d > T e n a n t   E n t r a   I d < / T e n a n t E n t r a I d > + 
+             < E n v i r o n m e n t N a m e > E n v i r o n m e n t   N a m e < / E n v i r o n m e n t N a m e > + 
+             < E n v i r o n m e n t T y p e > E n v i r o n m e n t   T y p e < / E n v i r o n m e n t T y p e > + 
+             < C o m p a n y N a m e > C o m p a n y   N a m e < / C o m p a n y N a m e > + 
+             < C o m p a n y D i s p l a y N a m e > C o m p a n y   D i s p l a y   N a m e < / C o m p a n y D i s p l a y N a m e > + 
+             < C o m p a n y I d > C o m p a n y   I D < / C o m p a n y I d > + 
+             < U s e r N a m e > U s e r   N a m e < / U s e r N a m e > + 
+             < D a t e A n d T i m e > D a t e   a n d   T i m e < / D a t e A n d T i m e > + 
+             < L a n g u a g e > L a n g u a g e < / L a n g u a g e > + 
+             < F o r m a t R e g i o n > F o r m a t   R e g i o n < / F o r m a t R e g i o n > + 
+             < D a t e T i m e V a l u e s > + 
+                 < Y e a r > Y e a r < / Y e a r > + 
+                 < M o n t h N u m b e r > M o n t h   N u m b e r < / M o n t h N u m b e r > + 
+                 < D a y N u m b e r > D a y   N u m b e r < / D a y N u m b e r > + 
+                 < H o u r > H o u r < / H o u r > + 
+                 < M i n u t e > M i n u t e < / M i n u t e > + 
+             < / D a t e T i m e V a l u e s > + 
+         < / R e p o r t R e q u e s t > + 
+         < C o m p a n y M e t a d a t a > + 
+             < C o m p a n y N a m e > C o m p a n y   N a m e < / C o m p a n y N a m e > + 
+             < C o m p a n y D i s p l a y N a m e > C o m p a n y   D i s p l a y   N a m e < / C o m p a n y D i s p l a y N a m e > + 
+             < C o m p a n y A d d r e s s L i n e s > + 
+                 < C o m p a n y A d d r e s s L i n e 1 > C o m p a n y   A d d r e s s   L i n e   1 < / C o m p a n y A d d r e s s L i n e 1 > + 
+                 < C o m p a n y A d d r e s s L i n e 2 > C o m p a n y   A d d r e s s   L i n e   2 < / C o m p a n y A d d r e s s L i n e 2 > + 
+                 < C o m p a n y A d d r e s s L i n e 3 > C o m p a n y   A d d r e s s   L i n e   3 < / C o m p a n y A d d r e s s L i n e 3 > + 
+                 < C o m p a n y A d d r e s s L i n e 4 > C o m p a n y   A d d r e s s   L i n e   4 < / C o m p a n y A d d r e s s L i n e 4 > + 
+                 < C o m p a n y A d d r e s s L i n e 5 > C o m p a n y   A d d r e s s   L i n e   5 < / C o m p a n y A d d r e s s L i n e 5 > + 
+                 < C o m p a n y A d d r e s s L i n e 6 > C o m p a n y   A d d r e s s   L i n e   6 < / C o m p a n y A d d r e s s L i n e 6 > + 
+                 < C o m p a n y A d d r e s s L i n e 7 > C o m p a n y   A d d r e s s   L i n e   7 < / C o m p a n y A d d r e s s L i n e 7 > + 
+                 < C o m p a n y A d d r e s s L i n e 8 > C o m p a n y   A d d r e s s   L i n e   8 < / C o m p a n y A d d r e s s L i n e 8 > + 
+             < / C o m p a n y A d d r e s s L i n e s > + 
+             < C o m p a n y P h o n e > C o m p a n y   P h o n e < / C o m p a n y P h o n e > + 
+             < C o m p a n y P h o n e C a p t i o n > C o m p a n y   P h o n e   C a p t i o n < / C o m p a n y P h o n e C a p t i o n > + 
+             < C o m p a n y F a x N o > C o m p a n y   F a x   N o . < / C o m p a n y F a x N o > + 
+             < C o m p a n y F a x N o C a p t i o n > C o m p a n y   F a x   N o .   C a p t i o n < / C o m p a n y F a x N o C a p t i o n > + 
+             < C o m p a n y E m a i l > C o m p a n y   E m a i l < / C o m p a n y E m a i l > + 
+             < C o m p a n y E m a i l C a p t i o n > C o m p a n y   E m a i l   C a p t i o n < / C o m p a n y E m a i l C a p t i o n > + 
+             < C o m p a n y H o m e P a g e > C o m p a n y   H o m e   P a g e < / C o m p a n y H o m e P a g e > + 
+             < C o m p a n y H o m e P a g e C a p t i o n > C o m p a n y   H o m e   P a g e   C a p t i o n < / C o m p a n y H o m e P a g e C a p t i o n > + 
+             < C o m p a n y L o g o > C o m p a n y   L o g o < / C o m p a n y L o g o > + 
+             < C o m p a n y V A T R e g i s t r a t i o n N o > C o m p a n y   V A T   R e g i s t r a t i o n   N o . < / C o m p a n y V A T R e g i s t r a t i o n N o > + 
+             < C o m p a n y V A T R e g i s t r a t i o n N o C a p t i o n > C o m p a n y   V A T   R e g i s t r a t i o n   N o .   C a p t i o n < / C o m p a n y V A T R e g i s t r a t i o n N o C a p t i o n > + 
+             < C o m p a n y R e g i s t r a t i o n N o > C o m p a n y   R e g i s t r a t i o n   N o . < / C o m p a n y R e g i s t r a t i o n N o > + 
+             < C o m p a n y R e g i s t r a t i o n N o C a p t i o n > C o m p a n y   R e g i s t r a t i o n   N o .   C a p t i o n < / C o m p a n y R e g i s t r a t i o n N o C a p t i o n > + 
+             < C o m p a n y B a n k N a m e > C o m p a n y   B a n k   N a m e < / C o m p a n y B a n k N a m e > + 
+             < C o m p a n y B a n k N a m e C a p t i o n > C o m p a n y   B a n k   N a m e   C a p t i o n < / C o m p a n y B a n k N a m e C a p t i o n > + 
+             < C o m p a n y B a n k A c c o u n t N o > C o m p a n y   B a n k   A c c o u n t   N o . < / C o m p a n y B a n k A c c o u n t N o > + 
+             < C o m p a n y B a n k A c c o u n t N o C a p t i o n > C o m p a n y   B a n k   A c c o u n t   N o .   C a p t i o n < / C o m p a n y B a n k A c c o u n t N o C a p t i o n > + 
+             < C o m p a n y B a n k B r a n c h N o > C o m p a n y   B a n k   B r a n c h   N o . < / C o m p a n y B a n k B r a n c h N o > + 
+             < C o m p a n y B a n k B r a n c h N o C a p t i o n > C o m p a n y   B a n k   B r a n c h   N o .   C a p t i o n < / C o m p a n y B a n k B r a n c h N o C a p t i o n > + 
+             < C o m p a n y I B A N > C o m p a n y   I B A N < / C o m p a n y I B A N > + 
+             < C o m p a n y I B A N C a p t i o n > C o m p a n y   I B A N   C a p t i o n < / C o m p a n y I B A N C a p t i o n > + 
+             < C o m p a n y B a n k S W I F T > C o m p a n y   B a n k   S W I F T < / C o m p a n y B a n k S W I F T > + 
+             < C o m p a n y B a n k S W I F T C a p t i o n > C o m p a n y   B a n k   S W I F T   C a p t i o n < / C o m p a n y B a n k S W I F T C a p t i o n > + 
+             < C o m p a n y G i r o N o > C o m p a n y   G i r o   N o . < / C o m p a n y G i r o N o > + 
+             < C o m p a n y G i r o N o C a p t i o n > C o m p a n y   G i r o   N o .   C a p t i o n < / C o m p a n y G i r o N o C a p t i o n > + 
+         < / C o m p a n y M e t a d a t a > + 
+     < / B C R e p o r t I n f o r m a t i o n > + 
+ < / N a v W o r d R e p o r t X m l P a r t > 
 </file>
 
 <file path=customXml/itemProps1.xml><?xml version="1.0" encoding="utf-8"?>
+<ds:datastoreItem xmlns:ds="http://schemas.openxmlformats.org/officeDocument/2006/customXml" ds:itemID="{89DB96BF-8133-438A-AAD3-A3C21079AEB1}">
+  <ds:schemaRefs>
+    <ds:schemaRef ds:uri="http://schemas.openxmlformats.org/officeDocument/2006/bibliography"/>
+  </ds:schemaRefs>
+</ds:datastoreItem>
+</file>
+
+<file path=customXml/itemProps2.xml><?xml version="1.0" encoding="utf-8"?>
 <ds:datastoreItem xmlns:ds="http://schemas.openxmlformats.org/officeDocument/2006/customXml" ds:itemID="{0FFE40E4-CA26-441C-A1D4-EB398D712217}">
   <ds:schemaRefs>
     <ds:schemaRef ds:uri="http://schemas.microsoft.com/office/2006/metadata/contentType"/>
@@ -32726,39 +32854,7 @@
 </ds:datastoreItem>
 </file>
 
-<file path=customXml/itemProps2.xml><?xml version="1.0" encoding="utf-8"?>
-<ds:datastoreItem xmlns:ds="http://schemas.openxmlformats.org/officeDocument/2006/customXml" ds:itemID="{89DB96BF-8133-438A-AAD3-A3C21079AEB1}">
-  <ds:schemaRefs>
-    <ds:schemaRef ds:uri="http://schemas.openxmlformats.org/officeDocument/2006/bibliography"/>
-  </ds:schemaRefs>
-</ds:datastoreItem>
-</file>
-
 <file path=customXml/itemProps3.xml><?xml version="1.0" encoding="utf-8"?>
-<ds:datastoreItem xmlns:ds="http://schemas.openxmlformats.org/officeDocument/2006/customXml" ds:itemID="{20B1C7BE-CC2E-41B2-B1D5-B0B8F36428EB}">
-  <ds:schemaRefs>
-    <ds:schemaRef ds:uri="urn:microsoft-dynamics-nav/reports/Tenant_Report_Defaults/2000000001/"/>
-  </ds:schemaRefs>
-</ds:datastoreItem>
-</file>
-
-<file path=customXml/itemProps4.xml><?xml version="1.0" encoding="utf-8"?>
-<ds:datastoreItem xmlns:ds="http://schemas.openxmlformats.org/officeDocument/2006/customXml" ds:itemID="{7AEC2198-F042-4C71-9FA1-0766E4DE10D1}">
-  <ds:schemaRefs>
-    <ds:schemaRef ds:uri="http://schemas.microsoft.com/sharepoint/v3/contenttype/forms"/>
-  </ds:schemaRefs>
-</ds:datastoreItem>
-</file>
-
-<file path=customXml/itemProps5.xml><?xml version="1.0" encoding="utf-8"?>
-<ds:datastoreItem xmlns:ds="http://schemas.openxmlformats.org/officeDocument/2006/customXml" ds:itemID="{E02279C7-2801-4BF1-B032-710495FC8DAA}">
-  <ds:schemaRefs>
-    <ds:schemaRef ds:uri="urn:microsoft-dynamics-businesscentral/internal/extended/reports/Tenant_Report_Defaults/2000000001/"/>
-  </ds:schemaRefs>
-</ds:datastoreItem>
-</file>
-
-<file path=customXml/itemProps6.xml><?xml version="1.0" encoding="utf-8"?>
 <ds:datastoreItem xmlns:ds="http://schemas.openxmlformats.org/officeDocument/2006/customXml" ds:itemID="{A86F1D83-C9A8-49B5-A7A4-4B754CFBD1D9}">
   <ds:schemaRefs>
     <ds:schemaRef ds:uri="http://schemas.microsoft.com/office/2006/metadata/properties"/>
@@ -32770,6 +32866,30 @@
 </ds:datastoreItem>
 </file>
 
+<file path=customXml/itemProps4.xml><?xml version="1.0" encoding="utf-8"?>
+<ds:datastoreItem xmlns:ds="http://schemas.openxmlformats.org/officeDocument/2006/customXml" ds:itemID="{E02279C7-2801-4BF1-B032-710495FC8DAA}">
+  <ds:schemaRefs>
+    <ds:schemaRef ds:uri="urn:microsoft-dynamics-businesscentral/internal/extended/reports/Tenant_Report_Defaults/2000000001/"/>
+  </ds:schemaRefs>
+</ds:datastoreItem>
+</file>
+
+<file path=customXml/itemProps5.xml><?xml version="1.0" encoding="utf-8"?>
+<ds:datastoreItem xmlns:ds="http://schemas.openxmlformats.org/officeDocument/2006/customXml" ds:itemID="{7AEC2198-F042-4C71-9FA1-0766E4DE10D1}">
+  <ds:schemaRefs>
+    <ds:schemaRef ds:uri="http://schemas.microsoft.com/sharepoint/v3/contenttype/forms"/>
+  </ds:schemaRefs>
+</ds:datastoreItem>
+</file>
+
+<file path=customXml/itemProps6.xml><?xml version="1.0" encoding="utf-8"?>
+<ds:datastoreItem xmlns:ds="http://schemas.openxmlformats.org/officeDocument/2006/customXml" ds:itemID="{20B1C7BE-CC2E-41B2-B1D5-B0B8F36428EB}">
+  <ds:schemaRefs>
+    <ds:schemaRef ds:uri="urn:microsoft-dynamics-nav/reports/Tenant_Report_Defaults/2000000001/"/>
+  </ds:schemaRefs>
+</ds:datastoreItem>
+</file>
+
 <file path=docMetadata/LabelInfo.xml><?xml version="1.0" encoding="utf-8"?>
 <clbl:labelList xmlns:clbl="http://schemas.microsoft.com/office/2020/mipLabelMetadata">
   <clbl:label id="{f42aa342-8706-4288-bd11-ebb85995028c}" enabled="1" method="Standard" siteId="{72f988bf-86f1-41af-91ab-2d7cd011db47}" contentBits="0" removed="0"/>

</xml_diff>